<commit_message>
docs: explain NDS scheduling as an end-to-end workflow
Signed-off-by: KaisennHu <74917084+KaisennHu@users.noreply.github.com>
</commit_message>
<xml_diff>
--- a/submissions/kaisennhu/00_快速入门/方案介绍.docx
+++ b/submissions/kaisennhu/00_快速入门/方案介绍.docx
@@ -7,7 +7,7 @@
         <w:pStyle w:val="Heading1"/>
       </w:pPr>
       <w:r>
-        <w:t>从零认识我们的 NDS 调度方案</w:t>
+        <w:t>从零认识NDS方案：任务怎样完成，算法怎样作决定</w:t>
       </w:r>
     </w:p>
     <w:p>
@@ -15,22 +15,71 @@
         <w:pStyle w:val="Heading2"/>
       </w:pPr>
       <w:r>
-        <w:t>先用一分钟了解我们解决什么</w:t>
+        <w:t>一、先建立全貌：当前读取与未来缓存是两个阶段</w:t>
       </w:r>
     </w:p>
     <w:p>
       <w:r>
-        <w:t>计算设备处理数据之前，必须先把数据从存储设备搬到计算设备的内存。数据分散、大小不一、内存空间有限，而且多个搬运任务会争用同一条通道。这道题要求我们决定：哪些数据一起搬、走哪条路线、怎样安排依赖，以及哪些数据值得额外缓存。</w:t>
+        <w:t>这道题研究的是数据搬运。计算卡要使用的数据原本放在SSD上，读取任务陆续到达。程序需要在有限带宽、临时内存和并发名额内，把每份数据送到指定位置。一次完整测试包含一串这样的请求，称为Trace。</w:t>
       </w:r>
     </w:p>
     <w:p>
       <w:r>
-        <w:t>我们的方案是一个在线调度程序。它只根据已经到达的请求、当前资源状态和历史访问记录作决定。主办方提供模拟器，负责计算这些决定实际要花多久、是否违反资源限制，以及最终得分。</w:t>
+        <w:t>我们的方案围绕两个问题展开：当前的数据怎样搬得划算；读完以后，要不要再付出一次搬运成本，把数据放进缓存，供后续访问使用。 前一个问题由前台调度解决，后一个问题由PROMOTE准入解决。官方模拟器执行计划、判断缓存命中并计分。</w:t>
       </w:r>
     </w:p>
     <w:p>
       <w:r>
-        <w:t>交付的是可以运行和验证的赛题调度算法，不是对真实 SSD 或 NPU 驱动的改造。报告中的性能数值来自官方确定性模拟器。</w:t>
+        <w:drawing>
+          <wp:inline xmlns:a="http://schemas.openxmlformats.org/drawingml/2006/main" xmlns:pic="http://schemas.openxmlformats.org/drawingml/2006/picture">
+            <wp:extent cx="5943600" cy="6339840"/>
+            <wp:docPr id="1" name="Picture 1"/>
+            <wp:cNvGraphicFramePr>
+              <a:graphicFrameLocks noChangeAspect="1"/>
+            </wp:cNvGraphicFramePr>
+            <a:graphic>
+              <a:graphicData uri="http://schemas.openxmlformats.org/drawingml/2006/picture">
+                <pic:pic>
+                  <pic:nvPicPr>
+                    <pic:cNvPr id="0" name="算法总体流程.png"/>
+                    <pic:cNvPicPr/>
+                  </pic:nvPicPr>
+                  <pic:blipFill>
+                    <a:blip r:embed="rId11"/>
+                    <a:stretch>
+                      <a:fillRect/>
+                    </a:stretch>
+                  </pic:blipFill>
+                  <pic:spPr>
+                    <a:xfrm>
+                      <a:off x="0" y="0"/>
+                      <a:ext cx="5943600" cy="6339840"/>
+                    </a:xfrm>
+                    <a:prstGeom prst="rect"/>
+                  </pic:spPr>
+                </pic:pic>
+              </a:graphicData>
+            </a:graphic>
+          </wp:inline>
+        </w:drawing>
+      </w:r>
+    </w:p>
+    <w:p>
+      <w:pPr>
+        <w:pStyle w:val="Caption"/>
+      </w:pPr>
+      <w:r>
+        <w:t>总体流程：先安排当前读取，完成后再判断缓存</w:t>
+      </w:r>
+    </w:p>
+    <w:p>
+      <w:r>
+        <w:t>当一批请求到达，框架先查缓存。命中的请求直接由框架搬运；未命中的请求交给我们，经过“整理与分块→比较合并和路径→观察窗口比较→提交计划”。单个请求读完后，框架再调用我们，检查是否值得PROMOTE。两条流程在整个Trace内反复发生，并非先读完整条Trace、最后统一缓存。</w:t>
+      </w:r>
+    </w:p>
+    <w:p>
+      <w:r>
+        <w:t>读者可以把这个程序理解为调度员：它制定搬运方案，既不能改客户什么时候下单，也不能自己宣布运输已完成。最后耗时和费用由模拟器独立核算。</w:t>
       </w:r>
     </w:p>
     <w:p>
@@ -38,7 +87,296 @@
         <w:pStyle w:val="Heading2"/>
       </w:pPr>
       <w:r>
-        <w:t>认识六个词就能继续阅读</w:t>
+        <w:t>二、理解流程需要的基本概念</w:t>
+      </w:r>
+    </w:p>
+    <w:p>
+      <w:pPr>
+        <w:pStyle w:val="Heading3"/>
+      </w:pPr>
+      <w:r>
+        <w:t>2.1 数据在哪里，任务如何表达</w:t>
+      </w:r>
+    </w:p>
+    <w:tbl>
+      <w:tblPr>
+        <w:tblStyle w:val="LightShading-Accent1"/>
+        <w:tblW w:type="auto" w:w="0"/>
+        <w:tblLook w:firstColumn="1" w:firstRow="1" w:lastColumn="0" w:lastRow="0" w:noHBand="0" w:noVBand="1" w:val="04A0"/>
+      </w:tblPr>
+      <w:tblGrid>
+        <w:gridCol w:w="5040"/>
+        <w:gridCol w:w="5040"/>
+      </w:tblGrid>
+      <w:tr>
+        <w:tc>
+          <w:tcPr>
+            <w:tcW w:type="dxa" w:w="5040"/>
+          </w:tcPr>
+          <w:p>
+            <w:r>
+              <w:rPr>
+                <w:sz w:val="18"/>
+              </w:rPr>
+              <w:t>名称</w:t>
+            </w:r>
+          </w:p>
+        </w:tc>
+        <w:tc>
+          <w:tcPr>
+            <w:tcW w:type="dxa" w:w="5040"/>
+          </w:tcPr>
+          <w:p>
+            <w:r>
+              <w:rPr>
+                <w:sz w:val="18"/>
+              </w:rPr>
+              <w:t>在本题中的含义</w:t>
+            </w:r>
+          </w:p>
+        </w:tc>
+      </w:tr>
+      <w:tr>
+        <w:tc>
+          <w:tcPr>
+            <w:tcW w:type="dxa" w:w="5040"/>
+          </w:tcPr>
+          <w:p>
+            <w:r>
+              <w:rPr>
+                <w:sz w:val="18"/>
+              </w:rPr>
+              <w:t>SSD</w:t>
+            </w:r>
+          </w:p>
+        </w:tc>
+        <w:tc>
+          <w:tcPr>
+            <w:tcW w:type="dxa" w:w="5040"/>
+          </w:tcPr>
+          <w:p>
+            <w:r>
+              <w:rPr>
+                <w:sz w:val="18"/>
+              </w:rPr>
+              <w:t>数据源，多张卡共享读取带宽</w:t>
+            </w:r>
+          </w:p>
+        </w:tc>
+      </w:tr>
+      <w:tr>
+        <w:tc>
+          <w:tcPr>
+            <w:tcW w:type="dxa" w:w="5040"/>
+          </w:tcPr>
+          <w:p>
+            <w:r>
+              <w:rPr>
+                <w:sz w:val="18"/>
+              </w:rPr>
+              <w:t>目标HBM</w:t>
+            </w:r>
+          </w:p>
+        </w:tc>
+        <w:tc>
+          <w:tcPr>
+            <w:tcW w:type="dxa" w:w="5040"/>
+          </w:tcPr>
+          <w:p>
+            <w:r>
+              <w:rPr>
+                <w:sz w:val="18"/>
+              </w:rPr>
+              <w:t>计算卡上接收本次请求数据的位置</w:t>
+            </w:r>
+          </w:p>
+        </w:tc>
+      </w:tr>
+      <w:tr>
+        <w:tc>
+          <w:tcPr>
+            <w:tcW w:type="dxa" w:w="5040"/>
+          </w:tcPr>
+          <w:p>
+            <w:r>
+              <w:rPr>
+                <w:sz w:val="18"/>
+              </w:rPr>
+              <w:t>临时HBM、DDR</w:t>
+            </w:r>
+          </w:p>
+        </w:tc>
+        <w:tc>
+          <w:tcPr>
+            <w:tcW w:type="dxa" w:w="5040"/>
+          </w:tcPr>
+          <w:p>
+            <w:r>
+              <w:rPr>
+                <w:sz w:val="18"/>
+              </w:rPr>
+              <w:t>两种中转空间，分别受容量限制，完成相关复制后可以复用</w:t>
+            </w:r>
+          </w:p>
+        </w:tc>
+      </w:tr>
+      <w:tr>
+        <w:tc>
+          <w:tcPr>
+            <w:tcW w:type="dxa" w:w="5040"/>
+          </w:tcPr>
+          <w:p>
+            <w:r>
+              <w:rPr>
+                <w:sz w:val="18"/>
+              </w:rPr>
+              <w:t>KVCache池</w:t>
+            </w:r>
+          </w:p>
+        </w:tc>
+        <w:tc>
+          <w:tcPr>
+            <w:tcW w:type="dxa" w:w="5040"/>
+          </w:tcPr>
+          <w:p>
+            <w:r>
+              <w:rPr>
+                <w:sz w:val="18"/>
+              </w:rPr>
+              <w:t>专门管理重复访问数据的缓存池，与目标HBM、中转池区分</w:t>
+            </w:r>
+          </w:p>
+        </w:tc>
+      </w:tr>
+      <w:tr>
+        <w:tc>
+          <w:tcPr>
+            <w:tcW w:type="dxa" w:w="5040"/>
+          </w:tcPr>
+          <w:p>
+            <w:r>
+              <w:rPr>
+                <w:sz w:val="18"/>
+              </w:rPr>
+              <w:t>IOCB</w:t>
+            </w:r>
+          </w:p>
+        </w:tc>
+        <w:tc>
+          <w:tcPr>
+            <w:tcW w:type="dxa" w:w="5040"/>
+          </w:tcPr>
+          <w:p>
+            <w:r>
+              <w:rPr>
+                <w:sz w:val="18"/>
+              </w:rPr>
+              <w:t>一份读取请求，包含SSD位置、长度、目标卡和目标片段</w:t>
+            </w:r>
+          </w:p>
+        </w:tc>
+      </w:tr>
+      <w:tr>
+        <w:tc>
+          <w:tcPr>
+            <w:tcW w:type="dxa" w:w="5040"/>
+          </w:tcPr>
+          <w:p>
+            <w:r>
+              <w:rPr>
+                <w:sz w:val="18"/>
+              </w:rPr>
+              <w:t>iov</w:t>
+            </w:r>
+          </w:p>
+        </w:tc>
+        <w:tc>
+          <w:tcPr>
+            <w:tcW w:type="dxa" w:w="5040"/>
+          </w:tcPr>
+          <w:p>
+            <w:r>
+              <w:rPr>
+                <w:sz w:val="18"/>
+              </w:rPr>
+              <w:t>目标HBM中的一个片段，一份请求可能有多个片段</w:t>
+            </w:r>
+          </w:p>
+        </w:tc>
+      </w:tr>
+      <w:tr>
+        <w:tc>
+          <w:tcPr>
+            <w:tcW w:type="dxa" w:w="5040"/>
+          </w:tcPr>
+          <w:p>
+            <w:r>
+              <w:rPr>
+                <w:sz w:val="18"/>
+              </w:rPr>
+              <w:t>operation</w:t>
+            </w:r>
+          </w:p>
+        </w:tc>
+        <w:tc>
+          <w:tcPr>
+            <w:tcW w:type="dxa" w:w="5040"/>
+          </w:tcPr>
+          <w:p>
+            <w:r>
+              <w:rPr>
+                <w:sz w:val="18"/>
+              </w:rPr>
+              <w:t>策略输出的一项操作，可覆盖多个当前请求的范围</w:t>
+            </w:r>
+          </w:p>
+        </w:tc>
+      </w:tr>
+      <w:tr>
+        <w:tc>
+          <w:tcPr>
+            <w:tcW w:type="dxa" w:w="5040"/>
+          </w:tcPr>
+          <w:p>
+            <w:r>
+              <w:rPr>
+                <w:sz w:val="18"/>
+              </w:rPr>
+              <w:t>transfer</w:t>
+            </w:r>
+          </w:p>
+        </w:tc>
+        <w:tc>
+          <w:tcPr>
+            <w:tcW w:type="dxa" w:w="5040"/>
+          </w:tcPr>
+          <w:p>
+            <w:r>
+              <w:rPr>
+                <w:sz w:val="18"/>
+              </w:rPr>
+              <w:t>操作内部的一条SSD读取或复制传输项</w:t>
+            </w:r>
+          </w:p>
+        </w:tc>
+      </w:tr>
+    </w:tbl>
+    <w:p>
+      <w:r>
+        <w:t>目标HBM中曾经存过某份数据，不会自动形成缓存命中。模拟器只检查KVCache池登记的键“卡编号、SSD起点、读取长度”，三项必须完全匹配，且缓存已经插入、未过期、未被驱逐。目标HBM地址和请求编号不属于这个缓存键。</w:t>
+      </w:r>
+    </w:p>
+    <w:p>
+      <w:r>
+        <w:t>缓存有两种独立失效原因：TTL到期会失效，与池子满不满无关；新对象插入时容量不足，会先清理过期项，再按LRU淘汰最久未访问的对象直到放得下。命中更新最近访问时间，但不延长TTL。比整个池子还大的对象不会被缓存。</w:t>
+      </w:r>
+    </w:p>
+    <w:p>
+      <w:pPr>
+        <w:pStyle w:val="Heading3"/>
+      </w:pPr>
+      <w:r>
+        <w:t>2.2 三条前台路径与两种后台来源</w:t>
       </w:r>
     </w:p>
     <w:tbl>
@@ -62,7 +400,7 @@
               <w:rPr>
                 <w:sz w:val="18"/>
               </w:rPr>
-              <w:t>名称</w:t>
+              <w:t>工作</w:t>
             </w:r>
           </w:p>
         </w:tc>
@@ -75,7 +413,7 @@
               <w:rPr>
                 <w:sz w:val="18"/>
               </w:rPr>
-              <w:t>通俗含义</w:t>
+              <w:t>数据路线</w:t>
             </w:r>
           </w:p>
         </w:tc>
@@ -88,324 +426,7 @@
               <w:rPr>
                 <w:sz w:val="18"/>
               </w:rPr>
-              <w:t>在本题中的作用</w:t>
-            </w:r>
-          </w:p>
-        </w:tc>
-      </w:tr>
-      <w:tr>
-        <w:tc>
-          <w:tcPr>
-            <w:tcW w:type="dxa" w:w="3360"/>
-          </w:tcPr>
-          <w:p>
-            <w:r>
-              <w:rPr>
-                <w:sz w:val="18"/>
-              </w:rPr>
-              <w:t>SSD</w:t>
-            </w:r>
-          </w:p>
-        </w:tc>
-        <w:tc>
-          <w:tcPr>
-            <w:tcW w:type="dxa" w:w="3360"/>
-          </w:tcPr>
-          <w:p>
-            <w:r>
-              <w:rPr>
-                <w:sz w:val="18"/>
-              </w:rPr>
-              <w:t>存放数据的固态硬盘</w:t>
-            </w:r>
-          </w:p>
-        </w:tc>
-        <w:tc>
-          <w:tcPr>
-            <w:tcW w:type="dxa" w:w="3360"/>
-          </w:tcPr>
-          <w:p>
-            <w:r>
-              <w:rPr>
-                <w:sz w:val="18"/>
-              </w:rPr>
-              <w:t>读取的起点，多张卡共享其带宽</w:t>
-            </w:r>
-          </w:p>
-        </w:tc>
-      </w:tr>
-      <w:tr>
-        <w:tc>
-          <w:tcPr>
-            <w:tcW w:type="dxa" w:w="3360"/>
-          </w:tcPr>
-          <w:p>
-            <w:r>
-              <w:rPr>
-                <w:sz w:val="18"/>
-              </w:rPr>
-              <w:t>HBM</w:t>
-            </w:r>
-          </w:p>
-        </w:tc>
-        <w:tc>
-          <w:tcPr>
-            <w:tcW w:type="dxa" w:w="3360"/>
-          </w:tcPr>
-          <w:p>
-            <w:r>
-              <w:rPr>
-                <w:sz w:val="18"/>
-              </w:rPr>
-              <w:t>计算设备上的高速内存</w:t>
-            </w:r>
-          </w:p>
-        </w:tc>
-        <w:tc>
-          <w:tcPr>
-            <w:tcW w:type="dxa" w:w="3360"/>
-          </w:tcPr>
-          <w:p>
-            <w:r>
-              <w:rPr>
-                <w:sz w:val="18"/>
-              </w:rPr>
-              <w:t>数据最终到达的位置，也有一部分临时空间</w:t>
-            </w:r>
-          </w:p>
-        </w:tc>
-      </w:tr>
-      <w:tr>
-        <w:tc>
-          <w:tcPr>
-            <w:tcW w:type="dxa" w:w="3360"/>
-          </w:tcPr>
-          <w:p>
-            <w:r>
-              <w:rPr>
-                <w:sz w:val="18"/>
-              </w:rPr>
-              <w:t>DDR</w:t>
-            </w:r>
-          </w:p>
-        </w:tc>
-        <w:tc>
-          <w:tcPr>
-            <w:tcW w:type="dxa" w:w="3360"/>
-          </w:tcPr>
-          <w:p>
-            <w:r>
-              <w:rPr>
-                <w:sz w:val="18"/>
-              </w:rPr>
-              <w:t>主机内存</w:t>
-            </w:r>
-          </w:p>
-        </w:tc>
-        <w:tc>
-          <w:tcPr>
-            <w:tcW w:type="dxa" w:w="3360"/>
-          </w:tcPr>
-          <w:p>
-            <w:r>
-              <w:rPr>
-                <w:sz w:val="18"/>
-              </w:rPr>
-              <w:t>可作为搬运中转站；与 HBM 临时池分别计容量</w:t>
-            </w:r>
-          </w:p>
-        </w:tc>
-      </w:tr>
-      <w:tr>
-        <w:tc>
-          <w:tcPr>
-            <w:tcW w:type="dxa" w:w="3360"/>
-          </w:tcPr>
-          <w:p>
-            <w:r>
-              <w:rPr>
-                <w:sz w:val="18"/>
-              </w:rPr>
-              <w:t>IOCB</w:t>
-            </w:r>
-          </w:p>
-        </w:tc>
-        <w:tc>
-          <w:tcPr>
-            <w:tcW w:type="dxa" w:w="3360"/>
-          </w:tcPr>
-          <w:p>
-            <w:r>
-              <w:rPr>
-                <w:sz w:val="18"/>
-              </w:rPr>
-              <w:t>一份读取任务单</w:t>
-            </w:r>
-          </w:p>
-        </w:tc>
-        <w:tc>
-          <w:tcPr>
-            <w:tcW w:type="dxa" w:w="3360"/>
-          </w:tcPr>
-          <w:p>
-            <w:r>
-              <w:rPr>
-                <w:sz w:val="18"/>
-              </w:rPr>
-              <w:t>描述读哪个位置、读多少，以及目标设备</w:t>
-            </w:r>
-          </w:p>
-        </w:tc>
-      </w:tr>
-      <w:tr>
-        <w:tc>
-          <w:tcPr>
-            <w:tcW w:type="dxa" w:w="3360"/>
-          </w:tcPr>
-          <w:p>
-            <w:r>
-              <w:rPr>
-                <w:sz w:val="18"/>
-              </w:rPr>
-              <w:t>iov</w:t>
-            </w:r>
-          </w:p>
-        </w:tc>
-        <w:tc>
-          <w:tcPr>
-            <w:tcW w:type="dxa" w:w="3360"/>
-          </w:tcPr>
-          <w:p>
-            <w:r>
-              <w:rPr>
-                <w:sz w:val="18"/>
-              </w:rPr>
-              <w:t>一个目标内存片段</w:t>
-            </w:r>
-          </w:p>
-        </w:tc>
-        <w:tc>
-          <w:tcPr>
-            <w:tcW w:type="dxa" w:w="3360"/>
-          </w:tcPr>
-          <w:p>
-            <w:r>
-              <w:rPr>
-                <w:sz w:val="18"/>
-              </w:rPr>
-              <w:t>一份任务可能要写入多个不相邻片段</w:t>
-            </w:r>
-          </w:p>
-        </w:tc>
-      </w:tr>
-      <w:tr>
-        <w:tc>
-          <w:tcPr>
-            <w:tcW w:type="dxa" w:w="3360"/>
-          </w:tcPr>
-          <w:p>
-            <w:r>
-              <w:rPr>
-                <w:sz w:val="18"/>
-              </w:rPr>
-              <w:t>Trace</w:t>
-            </w:r>
-          </w:p>
-        </w:tc>
-        <w:tc>
-          <w:tcPr>
-            <w:tcW w:type="dxa" w:w="3360"/>
-          </w:tcPr>
-          <w:p>
-            <w:r>
-              <w:rPr>
-                <w:sz w:val="18"/>
-              </w:rPr>
-              <w:t>按时间排列的请求记录</w:t>
-            </w:r>
-          </w:p>
-        </w:tc>
-        <w:tc>
-          <w:tcPr>
-            <w:tcW w:type="dxa" w:w="3360"/>
-          </w:tcPr>
-          <w:p>
-            <w:r>
-              <w:rPr>
-                <w:sz w:val="18"/>
-              </w:rPr>
-              <w:t>模拟器用它重现整个工作过程</w:t>
-            </w:r>
-          </w:p>
-        </w:tc>
-      </w:tr>
-    </w:tbl>
-    <w:p>
-      <w:r>
-        <w:t>这里的 KVCache 内存池是另一块用于重复访问的缓存空间。缓存键是“设备、SSD 起点、长度”，不是只看文件位置；两份读请求只有键一致，才可能共享这份缓存。</w:t>
-      </w:r>
-    </w:p>
-    <w:p>
-      <w:pPr>
-        <w:pStyle w:val="Heading2"/>
-      </w:pPr>
-      <w:r>
-        <w:t>为什么不能所有数据都走同一条路</w:t>
-      </w:r>
-    </w:p>
-    <w:p>
-      <w:r>
-        <w:t>可以把 SSD 看成仓库，把目标 HBM 看成工作台。搬货有三条路线：</w:t>
-      </w:r>
-    </w:p>
-    <w:tbl>
-      <w:tblPr>
-        <w:tblStyle w:val="LightShading-Accent1"/>
-        <w:tblW w:type="auto" w:w="0"/>
-        <w:tblLook w:firstColumn="1" w:firstRow="1" w:lastColumn="0" w:lastRow="0" w:noHBand="0" w:noVBand="1" w:val="04A0"/>
-      </w:tblPr>
-      <w:tblGrid>
-        <w:gridCol w:w="3360"/>
-        <w:gridCol w:w="3360"/>
-        <w:gridCol w:w="3360"/>
-      </w:tblGrid>
-      <w:tr>
-        <w:tc>
-          <w:tcPr>
-            <w:tcW w:type="dxa" w:w="3360"/>
-          </w:tcPr>
-          <w:p>
-            <w:r>
-              <w:rPr>
-                <w:sz w:val="18"/>
-              </w:rPr>
-              <w:t>路径</w:t>
-            </w:r>
-          </w:p>
-        </w:tc>
-        <w:tc>
-          <w:tcPr>
-            <w:tcW w:type="dxa" w:w="3360"/>
-          </w:tcPr>
-          <w:p>
-            <w:r>
-              <w:rPr>
-                <w:sz w:val="18"/>
-              </w:rPr>
-              <w:t>数据怎么走</w:t>
-            </w:r>
-          </w:p>
-        </w:tc>
-        <w:tc>
-          <w:tcPr>
-            <w:tcW w:type="dxa" w:w="3360"/>
-          </w:tcPr>
-          <w:p>
-            <w:r>
-              <w:rPr>
-                <w:sz w:val="18"/>
-              </w:rPr>
-              <w:t>适用条件和代价</w:t>
+              <w:t>主要消耗</w:t>
             </w:r>
           </w:p>
         </w:tc>
@@ -433,7 +454,7 @@
               <w:rPr>
                 <w:sz w:val="18"/>
               </w:rPr>
-              <w:t>SSD → 目标 HBM</w:t>
+              <w:t>SSD→目标HBM</w:t>
             </w:r>
           </w:p>
         </w:tc>
@@ -446,7 +467,7 @@
               <w:rPr>
                 <w:sz w:val="18"/>
               </w:rPr>
-              <w:t>路线短，但每个实际读取和写入片段都要满足 512 字节对齐</w:t>
+              <w:t>SSD带宽；要求相关地址与长度满足512B对齐</w:t>
             </w:r>
           </w:p>
         </w:tc>
@@ -474,7 +495,7 @@
               <w:rPr>
                 <w:sz w:val="18"/>
               </w:rPr>
-              <w:t>SSD → 临时 HBM → 目标 HBM</w:t>
+              <w:t>SSD→临时HBM→目标HBM</w:t>
             </w:r>
           </w:p>
         </w:tc>
@@ -487,7 +508,7 @@
               <w:rPr>
                 <w:sz w:val="18"/>
               </w:rPr>
-              <w:t>可以先合并读取，再在设备内分发；占用临时 HBM、任务槽位和 D2D 复制资源</w:t>
+              <w:t>SSD、临时HBM、卡内D2D复制</w:t>
             </w:r>
           </w:p>
         </w:tc>
@@ -515,7 +536,7 @@
               <w:rPr>
                 <w:sz w:val="18"/>
               </w:rPr>
-              <w:t>SSD → DDR → 目标 HBM</w:t>
+              <w:t>SSD→DDR→目标HBM</w:t>
             </w:r>
           </w:p>
         </w:tc>
@@ -528,7 +549,130 @@
               <w:rPr>
                 <w:sz w:val="18"/>
               </w:rPr>
-              <w:t>通过主机内存中转；占用 DDR 和 H2D 复制资源</w:t>
+              <w:t>SSD、DDR、主机到卡的H2D复制</w:t>
+            </w:r>
+          </w:p>
+        </w:tc>
+      </w:tr>
+      <w:tr>
+        <w:tc>
+          <w:tcPr>
+            <w:tcW w:type="dxa" w:w="3360"/>
+          </w:tcPr>
+          <w:p>
+            <w:r>
+              <w:rPr>
+                <w:sz w:val="18"/>
+              </w:rPr>
+              <w:t>PROMOTE_HBM</w:t>
+            </w:r>
+          </w:p>
+        </w:tc>
+        <w:tc>
+          <w:tcPr>
+            <w:tcW w:type="dxa" w:w="3360"/>
+          </w:tcPr>
+          <w:p>
+            <w:r>
+              <w:rPr>
+                <w:sz w:val="18"/>
+              </w:rPr>
+              <w:t>HBM→KVCache池</w:t>
+            </w:r>
+          </w:p>
+        </w:tc>
+        <w:tc>
+          <w:tcPr>
+            <w:tcW w:type="dxa" w:w="3360"/>
+          </w:tcPr>
+          <w:p>
+            <w:r>
+              <w:rPr>
+                <w:sz w:val="18"/>
+              </w:rPr>
+              <w:t>卡到主机的D2H复制</w:t>
+            </w:r>
+          </w:p>
+        </w:tc>
+      </w:tr>
+      <w:tr>
+        <w:tc>
+          <w:tcPr>
+            <w:tcW w:type="dxa" w:w="3360"/>
+          </w:tcPr>
+          <w:p>
+            <w:r>
+              <w:rPr>
+                <w:sz w:val="18"/>
+              </w:rPr>
+              <w:t>PROMOTE_SSD</w:t>
+            </w:r>
+          </w:p>
+        </w:tc>
+        <w:tc>
+          <w:tcPr>
+            <w:tcW w:type="dxa" w:w="3360"/>
+          </w:tcPr>
+          <w:p>
+            <w:r>
+              <w:rPr>
+                <w:sz w:val="18"/>
+              </w:rPr>
+              <w:t>SSD→KVCache池</w:t>
+            </w:r>
+          </w:p>
+        </w:tc>
+        <w:tc>
+          <w:tcPr>
+            <w:tcW w:type="dxa" w:w="3360"/>
+          </w:tcPr>
+          <w:p>
+            <w:r>
+              <w:rPr>
+                <w:sz w:val="18"/>
+              </w:rPr>
+              <w:t>SSD读取</w:t>
+            </w:r>
+          </w:p>
+        </w:tc>
+      </w:tr>
+      <w:tr>
+        <w:tc>
+          <w:tcPr>
+            <w:tcW w:type="dxa" w:w="3360"/>
+          </w:tcPr>
+          <w:p>
+            <w:r>
+              <w:rPr>
+                <w:sz w:val="18"/>
+              </w:rPr>
+              <w:t>缓存命中</w:t>
+            </w:r>
+          </w:p>
+        </w:tc>
+        <w:tc>
+          <w:tcPr>
+            <w:tcW w:type="dxa" w:w="3360"/>
+          </w:tcPr>
+          <w:p>
+            <w:r>
+              <w:rPr>
+                <w:sz w:val="18"/>
+              </w:rPr>
+              <w:t>KVCache池→目标HBM</w:t>
+            </w:r>
+          </w:p>
+        </w:tc>
+        <w:tc>
+          <w:tcPr>
+            <w:tcW w:type="dxa" w:w="3360"/>
+          </w:tcPr>
+          <w:p>
+            <w:r>
+              <w:rPr>
+                <w:sz w:val="18"/>
+              </w:rPr>
+              <w:t>H2D带宽、并发名额及调用成本</w:t>
             </w:r>
           </w:p>
         </w:tc>
@@ -536,152 +680,44 @@
     </w:tbl>
     <w:p>
       <w:r>
-        <w:t>“对齐”可以理解为按固定格子取货：起点和长度都落在 512 字节格子边界上。数据不对齐时，可能需要多读首尾一点，再只把真正需要的部分复制到目标。不能把多读的数据写到无关位置。</w:t>
+        <w:t>三条前台路径都可以组织多个同卡请求，是否能合并取决于对齐、范围、容量等约束。合并决定“哪些数据由一组操作服务”，并发决定“哪些传输同时执行”。把三次小读取变成一次大读取，不等于增加了三个并发。</w:t>
       </w:r>
     </w:p>
     <w:p>
       <w:r>
-        <w:t>合并也不是越多越好。大批合并能减少调用，但可能长期占住任务槽位，让后面的批次排队。切得太碎则会增加命令数，还可能产生几字节的小尾块。因此，我们同时考虑块大小、分组边界和路径。</w:t>
+        <w:t>题目中的并发度是某个资源上已经启动、尚未完成的传输项数量，排队等待的项不计入。SSD跨所有卡统一统计，包含前台读取与PROMOTE_SSD；H2D、D2H、D2D各自按卡统计。比如两条前台SSD读取加一条PROMOTE_SSD同时活动，SSD并发度是3；同卡一条命中H2D加一条FALLBACK的H2D同时活动，该卡H2D并发度是2。</w:t>
+      </w:r>
+    </w:p>
+    <w:p>
+      <w:r>
+        <w:t>“实际并发度”表示当前跑多少项，“并发上限”表示最多允许多少项。复制达到上限后，新项等待。CPU核数、请求槽位数、operation数量和累计调用次数都不等于这个并发度；三份请求合成一条SSD传输，这条传输只贡献一个SSD并发。活动项变化时，模拟器重新查性能桶并计算各项速率。</w:t>
+      </w:r>
+    </w:p>
+    <w:p>
+      <w:r>
+        <w:t>前后台也没有自动隔离的带宽：PROMOTE_SSD和所有前台SSD读取竞争；缓存命中与同卡FALLBACK的H2D阶段竞争。在本题模型中，H2D、D2H、D2D按卡和类型分别建模；较低优先级只影响待启动选择，不能保证启动后的PROMOTE不影响前台。</w:t>
       </w:r>
     </w:p>
     <w:p>
       <w:pPr>
-        <w:pStyle w:val="Heading2"/>
+        <w:pStyle w:val="Heading3"/>
       </w:pPr>
       <w:r>
-        <w:t>什么叫“更好的方案”</w:t>
+        <w:t>2.3 综合成本J怎样算，固定费用又是什么</w:t>
       </w:r>
     </w:p>
     <w:p>
       <w:r>
-        <w:t>赛题用综合成本 J 衡量一个完整 Trace：</w:t>
+        <w:t>整个Trace的目标是最小化：</w:t>
       </w:r>
     </w:p>
     <w:p>
       <w:r>
-        <w:t>J = 时间权重 × 整体完成时间 + CPU 调用成本 + NPU 调用成本</w:t>
-      </w:r>
-    </w:p>
-    <w:p>
-      <w:r>
-        <w:t>J 越低越好。这里的调用成本是赛题规定的计分数值，不等于本机实际占用的 CPU 时间。把每次搬运变快，却增加大量调用，可能反而得分更低。</w:t>
-      </w:r>
-    </w:p>
-    <w:p>
-      <w:r>
-        <w:t>公开自动评分最多 90 分，另有 10 分设计与可复现性由评委评定。单条输入达到冻结参考成本后，该条优化分封顶；继续降低 J 可以改善同分排序。合法性和资源限制也会影响得分。</w:t>
-      </w:r>
-    </w:p>
-    <w:p>
-      <w:pPr>
-        <w:pStyle w:val="Heading2"/>
-      </w:pPr>
-      <w:r>
-        <w:t>我们怎样作一次决定</w:t>
-      </w:r>
-    </w:p>
-    <w:p>
-      <w:pPr>
-        <w:pStyle w:val="ListNumber"/>
-      </w:pPr>
-      <w:r>
-        <w:t>看清当前任务。 读取可见的未命中请求和运行状态，为目标内存片段建立索引。</w:t>
-      </w:r>
-    </w:p>
-    <w:p>
-      <w:pPr>
-        <w:pStyle w:val="ListNumber"/>
-      </w:pPr>
-      <w:r>
-        <w:t>生成可行的搬运方案。 先按容量切分，再把同一张卡上相接或重叠的 SSD 区间组织起来。动态规划比较合并边界及路径。</w:t>
-      </w:r>
-    </w:p>
-    <w:p>
-      <w:pPr>
-        <w:pStyle w:val="ListNumber"/>
-      </w:pPr>
-      <w:r>
-        <w:t>比较少量完整候选。 在计算预算允许时，比较不同块长和路径组合，并利用已经到达、尚有任务未完成的批次观察槽位、缓冲池和流水竞争。不会读取后续 Trace。</w:t>
-      </w:r>
-    </w:p>
-    <w:p>
-      <w:pPr>
-        <w:pStyle w:val="ListNumber"/>
-      </w:pPr>
-      <w:r>
-        <w:t>提交当前决定。 输出读取、复制及它们的先后依赖。过去已执行的操作不会被改写；窗口内的反事实比较只是帮助选择当前方案。</w:t>
-      </w:r>
-    </w:p>
-    <w:p>
-      <w:pPr>
-        <w:pStyle w:val="ListNumber"/>
-      </w:pPr>
-      <w:r>
-        <w:t>由模拟器执行并反馈。 完成时再判断是否值得把这个对象加入缓存。</w:t>
-      </w:r>
-    </w:p>
-    <w:p>
-      <w:r>
-        <w:t>如果输入包含特别多的内存片段，程序会限制局部模拟的工作量，使用合法的区间规划结果，避免把决策本身变成瓶颈。</w:t>
-      </w:r>
-    </w:p>
-    <w:p>
-      <w:pPr>
-        <w:pStyle w:val="Heading2"/>
-      </w:pPr>
-      <w:r>
-        <w:t>缓存为什么也可能让结果变差</w:t>
-      </w:r>
-    </w:p>
-    <w:p>
-      <w:r>
-        <w:t>缓存不是免费的。把一份数据加入 KVCache 池，要额外从 SSD 或 HBM 搬运一次；以后命中缓存，仍需从缓存池复制到目标 HBM。如果加入缓存后再也不用，这次投入就没有回报。</w:t>
-      </w:r>
-    </w:p>
-    <w:p>
-      <w:r>
-        <w:t>我们的准入规则同时检查：对象是否放得下、是否观察到跨时刻重复访问、最近需求是否仍然新鲜、是否已经缓存或正在提升，以及命中是否比再次前台读取更划算。</w:t>
-      </w:r>
-    </w:p>
-    <w:p>
-      <w:r>
-        <w:t>后台投入由已经观察到的同键读取工作量形成预算，而不是直接假定未来会复用很多次。实际命中还会反馈到后续预算。对于突然停止的访问或等待很久才完成的任务，新鲜度检查会抑制过时的缓存投入。</w:t>
-      </w:r>
-    </w:p>
-    <w:p>
-      <w:r>
-        <w:t>这仍是在线预测：相同的前两次访问，后面可能继续访问，也可能立即结束。任何不看未来的策略都无法提前确定是哪种情况。方案通过约束投入降低风险，不承诺每次缓存都能获利。</w:t>
-      </w:r>
-    </w:p>
-    <w:p>
-      <w:pPr>
-        <w:pStyle w:val="Heading2"/>
-      </w:pPr>
-      <w:r>
-        <w:t>一个容易理解的例子</w:t>
-      </w:r>
-    </w:p>
-    <w:p>
-      <w:r>
-        <w:t>假设同一张卡收到多份相邻的小读取任务。逐个读取会产生许多命令；合并读取可能减少调用。若目标地址不对齐，程序会比较“临时 HBM 分发”和“DDR 中转”。</w:t>
-      </w:r>
-    </w:p>
-    <w:p>
-      <w:r>
-        <w:t>如果后面已经到达的批次也在排队，程序会进一步检查：前一种路径是否把任务槽位占满，从而阻塞后面的读取。选择依据是这些可见请求在官方资源规则下的成本，不是输入文件叫什么。</w:t>
-      </w:r>
-    </w:p>
-    <w:p>
-      <w:r>
-        <w:t>如果某个对象稍后再次出现，程序再结合已观察到的访问节奏和收益预算决定是否缓存；如果它已经很久没有新请求，就不因为历史上重复过而盲目提升。</w:t>
-      </w:r>
-    </w:p>
-    <w:p>
-      <w:pPr>
-        <w:pStyle w:val="Heading2"/>
-      </w:pPr>
-      <w:r>
-        <w:t>如何判断我们的结论可信</w:t>
+        <w:rPr>
+          <w:rFonts w:ascii="Courier New" w:hAnsi="Courier New"/>
+          <w:sz w:val="16"/>
+        </w:rPr>
+        <w:t>J = time_cost_per_us × TraceTime + CPUCost + NPUCost</w:t>
       </w:r>
     </w:p>
     <w:tbl>
@@ -691,33 +727,47 @@
         <w:tblLook w:firstColumn="1" w:firstRow="1" w:lastColumn="0" w:lastRow="0" w:noHBand="0" w:noVBand="1" w:val="04A0"/>
       </w:tblPr>
       <w:tblGrid>
-        <w:gridCol w:w="5040"/>
-        <w:gridCol w:w="5040"/>
+        <w:gridCol w:w="3360"/>
+        <w:gridCol w:w="3360"/>
+        <w:gridCol w:w="3360"/>
       </w:tblGrid>
       <w:tr>
         <w:tc>
           <w:tcPr>
-            <w:tcW w:type="dxa" w:w="5040"/>
+            <w:tcW w:type="dxa" w:w="3360"/>
           </w:tcPr>
           <w:p>
             <w:r>
               <w:rPr>
                 <w:sz w:val="18"/>
               </w:rPr>
-              <w:t>要回答的问题</w:t>
+              <w:t>参数</w:t>
             </w:r>
           </w:p>
         </w:tc>
         <w:tc>
           <w:tcPr>
-            <w:tcW w:type="dxa" w:w="5040"/>
+            <w:tcW w:type="dxa" w:w="3360"/>
           </w:tcPr>
           <w:p>
             <w:r>
               <w:rPr>
                 <w:sz w:val="18"/>
               </w:rPr>
-              <w:t>包内证据</w:t>
+              <w:t>意义</w:t>
+            </w:r>
+          </w:p>
+        </w:tc>
+        <w:tc>
+          <w:tcPr>
+            <w:tcW w:type="dxa" w:w="3360"/>
+          </w:tcPr>
+          <w:p>
+            <w:r>
+              <w:rPr>
+                <w:sz w:val="18"/>
+              </w:rPr>
+              <w:t>谁决定</w:t>
             </w:r>
           </w:p>
         </w:tc>
@@ -725,27 +775,40 @@
       <w:tr>
         <w:tc>
           <w:tcPr>
-            <w:tcW w:type="dxa" w:w="5040"/>
+            <w:tcW w:type="dxa" w:w="3360"/>
           </w:tcPr>
           <w:p>
             <w:r>
               <w:rPr>
                 <w:sz w:val="18"/>
               </w:rPr>
-              <w:t>是否遵守题目规则？</w:t>
+              <w:t>time_cost_per_us</w:t>
             </w:r>
           </w:p>
         </w:tc>
         <w:tc>
           <w:tcPr>
-            <w:tcW w:type="dxa" w:w="5040"/>
+            <w:tcW w:type="dxa" w:w="3360"/>
           </w:tcPr>
           <w:p>
             <w:r>
               <w:rPr>
                 <w:sz w:val="18"/>
               </w:rPr>
-              <w:t>官方独立回放、功能回归、边界和变形检查</w:t>
+              <w:t>每微秒换算为多少成本单位；当前公开参数为1</w:t>
+            </w:r>
+          </w:p>
+        </w:tc>
+        <w:tc>
+          <w:tcPr>
+            <w:tcW w:type="dxa" w:w="3360"/>
+          </w:tcPr>
+          <w:p>
+            <w:r>
+              <w:rPr>
+                <w:sz w:val="18"/>
+              </w:rPr>
+              <w:t>主办方固定</w:t>
             </w:r>
           </w:p>
         </w:tc>
@@ -753,27 +816,40 @@
       <w:tr>
         <w:tc>
           <w:tcPr>
-            <w:tcW w:type="dxa" w:w="5040"/>
+            <w:tcW w:type="dxa" w:w="3360"/>
           </w:tcPr>
           <w:p>
             <w:r>
               <w:rPr>
                 <w:sz w:val="18"/>
               </w:rPr>
-              <w:t>是否比官方贪心更好？</w:t>
+              <w:t>TraceTime</w:t>
             </w:r>
           </w:p>
         </w:tc>
         <w:tc>
           <w:tcPr>
-            <w:tcW w:type="dxa" w:w="5040"/>
+            <w:tcW w:type="dxa" w:w="3360"/>
           </w:tcPr>
           <w:p>
             <w:r>
               <w:rPr>
                 <w:sz w:val="18"/>
               </w:rPr>
-              <w:t>逐条 J 对照，包含较差的输入，不只展示平均值</w:t>
+              <w:t>从第一个请求到达，到模拟器中全部已提交传输结束的历时，包含尾部PROMOTE</w:t>
+            </w:r>
+          </w:p>
+        </w:tc>
+        <w:tc>
+          <w:tcPr>
+            <w:tcW w:type="dxa" w:w="3360"/>
+          </w:tcPr>
+          <w:p>
+            <w:r>
+              <w:rPr>
+                <w:sz w:val="18"/>
+              </w:rPr>
+              <w:t>模拟器执行后计算</w:t>
             </w:r>
           </w:p>
         </w:tc>
@@ -781,27 +857,40 @@
       <w:tr>
         <w:tc>
           <w:tcPr>
-            <w:tcW w:type="dxa" w:w="5040"/>
+            <w:tcW w:type="dxa" w:w="3360"/>
           </w:tcPr>
           <w:p>
             <w:r>
               <w:rPr>
                 <w:sz w:val="18"/>
               </w:rPr>
-              <w:t>是否只适用于公开题？</w:t>
+              <w:t>CPUCost</w:t>
             </w:r>
           </w:p>
         </w:tc>
         <w:tc>
           <w:tcPr>
-            <w:tcW w:type="dxa" w:w="5040"/>
+            <w:tcW w:type="dxa" w:w="3360"/>
           </w:tcPr>
           <w:p>
             <w:r>
               <w:rPr>
                 <w:sz w:val="18"/>
               </w:rPr>
-              <w:t>多种合成分布、冻结后独立家族，以及明确的测试范围说明</w:t>
+              <w:t>所有操作固定费、SSD命令费和CPU侧复制调用费的累计</w:t>
+            </w:r>
+          </w:p>
+        </w:tc>
+        <w:tc>
+          <w:tcPr>
+            <w:tcW w:type="dxa" w:w="3360"/>
+          </w:tcPr>
+          <w:p>
+            <w:r>
+              <w:rPr>
+                <w:sz w:val="18"/>
+              </w:rPr>
+              <w:t>根据我们的计划和框架自动命中搬运累计</w:t>
             </w:r>
           </w:p>
         </w:tc>
@@ -809,27 +898,131 @@
       <w:tr>
         <w:tc>
           <w:tcPr>
-            <w:tcW w:type="dxa" w:w="5040"/>
+            <w:tcW w:type="dxa" w:w="3360"/>
           </w:tcPr>
           <w:p>
             <w:r>
               <w:rPr>
                 <w:sz w:val="18"/>
               </w:rPr>
-              <w:t>是否能稳定复现？</w:t>
+              <w:t>NPUCost</w:t>
             </w:r>
           </w:p>
         </w:tc>
         <w:tc>
           <w:tcPr>
-            <w:tcW w:type="dxa" w:w="5040"/>
+            <w:tcW w:type="dxa" w:w="3360"/>
           </w:tcPr>
           <w:p>
             <w:r>
               <w:rPr>
                 <w:sz w:val="18"/>
               </w:rPr>
-              <w:t>固定源码和输入哈希，每条三次输出哈希核验</w:t>
+              <w:t>H2D、D2H、D2D等复制项的NPU侧调用费累计</w:t>
+            </w:r>
+          </w:p>
+        </w:tc>
+        <w:tc>
+          <w:tcPr>
+            <w:tcW w:type="dxa" w:w="3360"/>
+          </w:tcPr>
+          <w:p>
+            <w:r>
+              <w:rPr>
+                <w:sz w:val="18"/>
+              </w:rPr>
+              <w:t>同上</w:t>
+            </w:r>
+          </w:p>
+        </w:tc>
+      </w:tr>
+    </w:tbl>
+    <w:p>
+      <w:r>
+        <w:t>“费用”是模型里的成本单位，不是真实货币，也不是本机CPU运行微秒数。若前台在585微秒完成，而已提交PROMOTE在683微秒才完成，第一个请求从0开始，则此SDK的TraceTime为683微秒。并行任务的各自耗时不能直接相加。</w:t>
+      </w:r>
+    </w:p>
+    <w:p>
+      <w:r>
+        <w:t>固定费是一个operation总CPU成本中的一部分。以FALLBACK为例，当前参数规定每个操作固定费8、每条SSD命令费2、每条H2D复制的CPU费1。因此一个操作包含一条SSD命令和一条H2D时，CPU成本是8+2+1=11，而不是8+11。</w:t>
+      </w:r>
+    </w:p>
+    <w:tbl>
+      <w:tblPr>
+        <w:tblStyle w:val="LightShading-Accent1"/>
+        <w:tblW w:type="auto" w:w="0"/>
+        <w:tblLook w:firstColumn="1" w:firstRow="1" w:lastColumn="0" w:lastRow="0" w:noHBand="0" w:noVBand="1" w:val="04A0"/>
+      </w:tblPr>
+      <w:tblGrid>
+        <w:gridCol w:w="2016"/>
+        <w:gridCol w:w="2016"/>
+        <w:gridCol w:w="2016"/>
+        <w:gridCol w:w="2016"/>
+        <w:gridCol w:w="2016"/>
+      </w:tblGrid>
+      <w:tr>
+        <w:tc>
+          <w:tcPr>
+            <w:tcW w:type="dxa" w:w="2016"/>
+          </w:tcPr>
+          <w:p>
+            <w:r>
+              <w:rPr>
+                <w:sz w:val="18"/>
+              </w:rPr>
+              <w:t>同样三个请求的组织方式</w:t>
+            </w:r>
+          </w:p>
+        </w:tc>
+        <w:tc>
+          <w:tcPr>
+            <w:tcW w:type="dxa" w:w="2016"/>
+          </w:tcPr>
+          <w:p>
+            <w:r>
+              <w:rPr>
+                <w:sz w:val="18"/>
+              </w:rPr>
+              <w:t>CPU固定费</w:t>
+            </w:r>
+          </w:p>
+        </w:tc>
+        <w:tc>
+          <w:tcPr>
+            <w:tcW w:type="dxa" w:w="2016"/>
+          </w:tcPr>
+          <w:p>
+            <w:r>
+              <w:rPr>
+                <w:sz w:val="18"/>
+              </w:rPr>
+              <w:t>SSD命令费</w:t>
+            </w:r>
+          </w:p>
+        </w:tc>
+        <w:tc>
+          <w:tcPr>
+            <w:tcW w:type="dxa" w:w="2016"/>
+          </w:tcPr>
+          <w:p>
+            <w:r>
+              <w:rPr>
+                <w:sz w:val="18"/>
+              </w:rPr>
+              <w:t>H2D的CPU费</w:t>
+            </w:r>
+          </w:p>
+        </w:tc>
+        <w:tc>
+          <w:tcPr>
+            <w:tcW w:type="dxa" w:w="2016"/>
+          </w:tcPr>
+          <w:p>
+            <w:r>
+              <w:rPr>
+                <w:sz w:val="18"/>
+              </w:rPr>
+              <w:t>CPU合计</w:t>
             </w:r>
           </w:p>
         </w:tc>
@@ -837,27 +1030,200 @@
       <w:tr>
         <w:tc>
           <w:tcPr>
-            <w:tcW w:type="dxa" w:w="5040"/>
+            <w:tcW w:type="dxa" w:w="2016"/>
           </w:tcPr>
           <w:p>
             <w:r>
               <w:rPr>
                 <w:sz w:val="18"/>
               </w:rPr>
-              <w:t>更大数据能否运行？</w:t>
+              <w:t>三个独立FALLBACK操作，各读一次、复制一次</w:t>
             </w:r>
           </w:p>
         </w:tc>
         <w:tc>
           <w:tcPr>
-            <w:tcW w:type="dxa" w:w="5040"/>
+            <w:tcW w:type="dxa" w:w="2016"/>
           </w:tcPr>
           <w:p>
             <w:r>
               <w:rPr>
                 <w:sz w:val="18"/>
               </w:rPr>
-              <w:t>十万请求及高 iov 压力测试，分别记录决策耗时和峰值内存</w:t>
+              <w:t>24</w:t>
+            </w:r>
+          </w:p>
+        </w:tc>
+        <w:tc>
+          <w:tcPr>
+            <w:tcW w:type="dxa" w:w="2016"/>
+          </w:tcPr>
+          <w:p>
+            <w:r>
+              <w:rPr>
+                <w:sz w:val="18"/>
+              </w:rPr>
+              <w:t>6</w:t>
+            </w:r>
+          </w:p>
+        </w:tc>
+        <w:tc>
+          <w:tcPr>
+            <w:tcW w:type="dxa" w:w="2016"/>
+          </w:tcPr>
+          <w:p>
+            <w:r>
+              <w:rPr>
+                <w:sz w:val="18"/>
+              </w:rPr>
+              <w:t>3</w:t>
+            </w:r>
+          </w:p>
+        </w:tc>
+        <w:tc>
+          <w:tcPr>
+            <w:tcW w:type="dxa" w:w="2016"/>
+          </w:tcPr>
+          <w:p>
+            <w:r>
+              <w:rPr>
+                <w:sz w:val="18"/>
+              </w:rPr>
+              <w:t>33</w:t>
+            </w:r>
+          </w:p>
+        </w:tc>
+      </w:tr>
+      <w:tr>
+        <w:tc>
+          <w:tcPr>
+            <w:tcW w:type="dxa" w:w="2016"/>
+          </w:tcPr>
+          <w:p>
+            <w:r>
+              <w:rPr>
+                <w:sz w:val="18"/>
+              </w:rPr>
+              <w:t>一个操作，仍分别读三次、复制三次</w:t>
+            </w:r>
+          </w:p>
+        </w:tc>
+        <w:tc>
+          <w:tcPr>
+            <w:tcW w:type="dxa" w:w="2016"/>
+          </w:tcPr>
+          <w:p>
+            <w:r>
+              <w:rPr>
+                <w:sz w:val="18"/>
+              </w:rPr>
+              <w:t>8</w:t>
+            </w:r>
+          </w:p>
+        </w:tc>
+        <w:tc>
+          <w:tcPr>
+            <w:tcW w:type="dxa" w:w="2016"/>
+          </w:tcPr>
+          <w:p>
+            <w:r>
+              <w:rPr>
+                <w:sz w:val="18"/>
+              </w:rPr>
+              <w:t>6</w:t>
+            </w:r>
+          </w:p>
+        </w:tc>
+        <w:tc>
+          <w:tcPr>
+            <w:tcW w:type="dxa" w:w="2016"/>
+          </w:tcPr>
+          <w:p>
+            <w:r>
+              <w:rPr>
+                <w:sz w:val="18"/>
+              </w:rPr>
+              <w:t>3</w:t>
+            </w:r>
+          </w:p>
+        </w:tc>
+        <w:tc>
+          <w:tcPr>
+            <w:tcW w:type="dxa" w:w="2016"/>
+          </w:tcPr>
+          <w:p>
+            <w:r>
+              <w:rPr>
+                <w:sz w:val="18"/>
+              </w:rPr>
+              <w:t>17</w:t>
+            </w:r>
+          </w:p>
+        </w:tc>
+      </w:tr>
+      <w:tr>
+        <w:tc>
+          <w:tcPr>
+            <w:tcW w:type="dxa" w:w="2016"/>
+          </w:tcPr>
+          <w:p>
+            <w:r>
+              <w:rPr>
+                <w:sz w:val="18"/>
+              </w:rPr>
+              <w:t>一个操作，一次大读取、一次多目标复制</w:t>
+            </w:r>
+          </w:p>
+        </w:tc>
+        <w:tc>
+          <w:tcPr>
+            <w:tcW w:type="dxa" w:w="2016"/>
+          </w:tcPr>
+          <w:p>
+            <w:r>
+              <w:rPr>
+                <w:sz w:val="18"/>
+              </w:rPr>
+              <w:t>8</w:t>
+            </w:r>
+          </w:p>
+        </w:tc>
+        <w:tc>
+          <w:tcPr>
+            <w:tcW w:type="dxa" w:w="2016"/>
+          </w:tcPr>
+          <w:p>
+            <w:r>
+              <w:rPr>
+                <w:sz w:val="18"/>
+              </w:rPr>
+              <w:t>2</w:t>
+            </w:r>
+          </w:p>
+        </w:tc>
+        <w:tc>
+          <w:tcPr>
+            <w:tcW w:type="dxa" w:w="2016"/>
+          </w:tcPr>
+          <w:p>
+            <w:r>
+              <w:rPr>
+                <w:sz w:val="18"/>
+              </w:rPr>
+              <w:t>1</w:t>
+            </w:r>
+          </w:p>
+        </w:tc>
+        <w:tc>
+          <w:tcPr>
+            <w:tcW w:type="dxa" w:w="2016"/>
+          </w:tcPr>
+          <w:p>
+            <w:r>
+              <w:rPr>
+                <w:sz w:val="18"/>
+              </w:rPr>
+              <w:t>11</w:t>
             </w:r>
           </w:p>
         </w:tc>
@@ -865,7 +1231,17 @@
     </w:tbl>
     <w:p>
       <w:r>
-        <w:t>最新数值统一见“05_验证结果/验证报告”，与随包源码哈希对应。公开成绩不能当成隐藏集排名，也不代表真实硬件上的加速比。</w:t>
+        <w:t>以上只计算CPU项。最后一种还有1单位NPU调用成本，传输时间另外进入TraceTime。一条命令搬4KiB或12KiB，命令费用相同，耗时可能不同；“2”是官方给FALLBACK规定的单价，不是SSD传输耗时。</w:t>
+      </w:r>
+    </w:p>
+    <w:p>
+      <w:r>
+        <w:t>其他典型单组CPU成本为：DIRECT=2、AGGREGATE=4、PROMOTE_HBM=81、PROMOTE_SSD=81、一次缓存命中=1。这些数字假设各组只有必要的一条SSD读取和/或一次复制。更多传输项分别累计。缓存命中还有1单位NPU成本，因此由框架自动处理也不免费。</w:t>
+      </w:r>
+    </w:p>
+    <w:p>
+      <w:r>
+        <w:t>公开评分再把每条输入的J换成60×min(1,参考J/方案J)，对这些分数加权平均，加上可行性20分和运行检查10分，形成90分自动评分；另10分人工评分。参考J由主办方冻结，不等于官方贪心成本，也不代表所有输入的理论最优值。</w:t>
       </w:r>
     </w:p>
     <w:p>
@@ -873,17 +1249,114 @@
         <w:pStyle w:val="Heading2"/>
       </w:pPr>
       <w:r>
-        <w:t>第一次使用这个材料包</w:t>
+        <w:t>三、沿着一次读取理解算法</w:t>
+      </w:r>
+    </w:p>
+    <w:p>
+      <w:pPr>
+        <w:pStyle w:val="Heading3"/>
+      </w:pPr>
+      <w:r>
+        <w:t>3.1 到达时先生成合法前台方案，再比较整体竞争</w:t>
       </w:r>
     </w:p>
     <w:p>
       <w:r>
-        <w:t>只阅读：先看本文，再看“02_算法方案/解题方案与验证报告.docx”。答辩材料在“06_答辩演示”。Windows 可以直接解压和阅读文档。</w:t>
+        <w:t>策略首先建立“SSD片段应该写到哪个HBM位置”的索引，并记录当前资源活动。大请求按容量切成块，不能DIRECT的片段按512B边界安排物理读取，复制时只写真正需要的数据。</w:t>
       </w:r>
     </w:p>
     <w:p>
       <w:r>
-        <w:t>运行程序：使用 Linux 或 Windows 中的 WSL。根目录提供统一入口：</w:t>
+        <w:t>接着把同卡、相接或重叠的SSD片段排在一起。区间动态规划同时比较“怎么分组”和“每组走哪条路径”。动态规划在这里就是反复比较不同分组边界，保留前面一段片段累计估计成本更低的组合，不是提前知道后续Trace。</w:t>
+      </w:r>
+    </w:p>
+    <w:p>
+      <w:r>
+        <w:t>逐组看起来便宜的计划，整体执行时仍可能卡在槽位和缓冲池上。因此普通规模输入还会比较少量不同块长、不同路径偏好的完整计划。比较窗口只包含当前和有限已见批次，并省略部分后台活动，属于近似。最后只提交当前批次的计划，过去已经提交的任务不会被改写。</w:t>
+      </w:r>
+    </w:p>
+    <w:p>
+      <w:pPr>
+        <w:pStyle w:val="Heading3"/>
+      </w:pPr>
+      <w:r>
+        <w:t>3.2 完成后先检查是否值得缓存，再选择来源</w:t>
+      </w:r>
+    </w:p>
+    <w:p>
+      <w:r>
+        <w:t>前台读取完成后，策略检查对象是否出现过跨时刻复用、是否放得下、最近需求是否仍然新鲜，以及是否已经缓存或正在提升。随后比较未来一次命中能省下的读取成本与命中自身H2D成本，要求净收益为正。</w:t>
+      </w:r>
+    </w:p>
+    <w:p>
+      <w:r>
+        <w:t>程序还用已经观察到的读取工作量形成提升预算，预算足够才投入PROMOTE。这样不用假定未来一定会命中很多次。它仍然可能判断错：同一段已见历史，后续既可能持续复用，也可能突然停止。</w:t>
+      </w:r>
+    </w:p>
+    <w:p>
+      <w:r>
+        <w:t>决定提升时，可以从HBM复制，也可以从SSD重新读入缓存池。当前实现比较对应的资源压力后选择来源，允许从当前时刻开始并设置较低优先级。实际是否立刻执行由框架决定。提升完成并插入缓存后，后续完整同键请求才可能命中。</w:t>
+      </w:r>
+    </w:p>
+    <w:p>
+      <w:pPr>
+        <w:pStyle w:val="Heading2"/>
+      </w:pPr>
+      <w:r>
+        <w:t>四、把前台和缓存连成一个完整例子</w:t>
+      </w:r>
+    </w:p>
+    <w:p>
+      <w:r>
+        <w:t>假设A、B、C是同卡、相邻SSD区间上的三个4KiB请求，目标HBM片段不满足DIRECT对齐。第一次到达时，它们都不在KV池中。以下假设比较结果选择合并FALLBACK，只用于说明流程。</w:t>
+      </w:r>
+    </w:p>
+    <w:p>
+      <w:r>
+        <w:t>程序先将三个请求组织为一项操作：一次读取12KiB到DDR，再用一次多目标H2D把三份4KiB分别写入各自目标。三个请求仍各自完成，但共享读取和复制的组织开销。此时CPU成本为11、NPU成本为1，再结合实际历时计入J。</w:t>
+      </w:r>
+    </w:p>
+    <w:p>
+      <w:r>
+        <w:t>第一次完成时没有充分复用证据，程序不提升。后来A的数据再次出现，完成后若复用、新鲜度、收益和预算都满足条件，就为A这个完整请求发起PROMOTE。合并读取过的B、C不会因此自动进入缓存。</w:t>
+      </w:r>
+    </w:p>
+    <w:p>
+      <w:r>
+        <w:t>A的提升执行期间，其他请求仍可继续到达和搬运。如果提升尚未完成，新的A请求仍可能未命中；提升成功且未失效后，再次出现的完整同键A请求则由框架从缓存池复制到目标HBM。它省去了SSD读取，却仍消耗H2D和调用成本，并向策略提供完成反馈。</w:t>
+      </w:r>
+    </w:p>
+    <w:p>
+      <w:r>
+        <w:t>这就是两个阶段的联系：前台决定当前这次工作怎样完成，后台决定是否为未来重复工作付出额外成本；下一批请求又会在变化后的缓存和资源状态下进入同一流程。</w:t>
+      </w:r>
+    </w:p>
+    <w:p>
+      <w:pPr>
+        <w:pStyle w:val="Heading2"/>
+      </w:pPr>
+      <w:r>
+        <w:t>五、如何阅读和验证这套方案</w:t>
+      </w:r>
+    </w:p>
+    <w:p>
+      <w:r>
+        <w:t>本方案不是某条路径或缓存规则单独取胜，而是让分组、路径、资源竞争和缓存投入使用同一套成本判断。能完成当前请求只是起点，还要检查整条Trace是否更便宜、最差输入是否回退，以及决策本身是否满足资源限制。</w:t>
+      </w:r>
+    </w:p>
+    <w:p>
+      <w:r>
+        <w:t>当前源码的公开自动分为89.9792/90；438条输入各三次运行及官方回放通过。较差输入也完整保留，公开成绩不代表隐藏集排名或真实硬件加速。详细结果见验证报告（../05_验证结果/验证报告.md）。</w:t>
+      </w:r>
+    </w:p>
+    <w:p>
+      <w:r>
+        <w:t>理解本文后，继续阅读算法设计（../02_算法方案/算法设计.md）：它按前台五步、完成后的缓存流程、贯穿例子和设计取舍展开，末尾再给出实现参数、复杂度与代码位置。程序目录（../03_程序/）和测试操作手册（../04_测试复现/测试操作手册.md）用于实际运行。</w:t>
+      </w:r>
+    </w:p>
+    <w:p>
+      <w:r>
+        <w:t>在Linux或Windows WSL中进入材料根目录，可以执行：</w:t>
       </w:r>
     </w:p>
     <w:p>
@@ -924,25 +1397,7 @@
     </w:p>
     <w:p>
       <w:r>
-        <w:t>第一条使用随包 Linux x86_64 程序，并自动调用官方校验器；后面三条从源码构建，需要 C++17 编译器、make 和 Python 3。根目录 README 说明全部命令。不了解 C++ 也可以先查看演示记录和逐例验证表。</w:t>
-      </w:r>
-    </w:p>
-    <w:p>
-      <w:pPr>
-        <w:pStyle w:val="Heading2"/>
-      </w:pPr>
-      <w:r>
-        <w:t>阅读顺序</w:t>
-      </w:r>
-    </w:p>
-    <w:p>
-      <w:r>
-        <w:t>入门介绍 → 题目与依据 → 算法设计及边界 → 程序 → 测试复现 → 验证结果 → 答辩演示。</w:t>
-      </w:r>
-    </w:p>
-    <w:p>
-      <w:r>
-        <w:t>整个提交只有一份调度策略：03_程序/player/solution.cpp。可执行程序、验证结果和说明文档都对应这份源码。</w:t>
+        <w:t>第一条使用Linux x86_64静态程序并自动校验；后面三条需要C++17编译器、make及Python 3.10或更高版本。图文和Word可直接阅读，不必先理解C++实现。</w:t>
       </w:r>
     </w:p>
     <w:sectPr>

</xml_diff>

<commit_message>
docs: explain scheduling rationale and baseline tradeoffs
Signed-off-by: KaisennHu <74917084+KaisennHu@users.noreply.github.com>
</commit_message>
<xml_diff>
--- a/submissions/kaisennhu/00_快速入门/方案介绍.docx
+++ b/submissions/kaisennhu/00_快速入门/方案介绍.docx
@@ -1346,6 +1346,11 @@
     </w:p>
     <w:p>
       <w:r>
+        <w:t>相比官方baseline逐iov选路、第二次未命中后尝试一次HBM提升，我们把相邻请求一起规划，比较多条路径的整体代价，再按复用收益决定缓存投入。关键认识是：少搬字节、少一次复制、命中更多，都不一定让总成本更低；必须连同调用费和资源等待一起计算。依据、对照和证据集中在设计依据与优化评述（../02_算法方案/设计依据与优化评述.md）。</w:t>
+      </w:r>
+    </w:p>
+    <w:p>
+      <w:r>
         <w:t>当前源码的公开自动分为89.9792/90；438条输入各三次运行及官方回放通过。较差输入也完整保留，公开成绩不代表隐藏集排名或真实硬件加速。详细结果见验证报告（../05_验证结果/验证报告.md）。</w:t>
       </w:r>
     </w:p>

</xml_diff>

<commit_message>
docs: explain scheduling rationale and baseline tradeoffs (#8)
现有流程说明已解释“怎么调度”，但缺少从赛题性质到策略选择的论证，以及相对官方baseline的多维评价。新增《设计依据与优化评述》，按“依据 → 性质与观察 → 路径冗余 → baseline改进 → 证据与限制”说明方案为何有效、何时可能回退。

- 区分可替代路径与冗余搬运，说明固定调用费、性能桶、共享带宽、容量及未知未来如何导出设计。
- 对照实际GreedyBaseline的逐iov选路、扩读比阈值、一次HBM提升，与本方案的联合规划、窗口比较和收益预算准入。
- 引用冻结记录，从得分、时间、CPU/NPU、读取量、缓存、通用性和资源代价评价；保留177条扩展对照中的17条回退，并明确尚无逐模块消融证据。
- 同步入门介绍、算法入口、答辩讲稿、正式Word/HTML及文件校验清单；GitHub保留直接可浏览的文件目录。

验证：74处变更文档/HTML链接与资源引用通过；两份Word完整性和内嵌流程图检查通过；552项材料哈希核验通过。本地交付同步后重新打包、解压，预编译程序运行和官方独立回放通过。

策略源码、SDK、原始测试数据和评分记录未变；本次未重新调参或运行完整性能评测。源码SHA256仍为 `6a30c42d1a939b131290c2802a1b2942fad991cc857dede96cbc3890b8cb22d6`。

Signed-off-by: KaisennHu <74917084+KaisennHu@users.noreply.github.com>
</commit_message>
<xml_diff>
--- a/submissions/kaisennhu/00_快速入门/方案介绍.docx
+++ b/submissions/kaisennhu/00_快速入门/方案介绍.docx
@@ -1346,6 +1346,11 @@
     </w:p>
     <w:p>
       <w:r>
+        <w:t>相比官方baseline逐iov选路、第二次未命中后尝试一次HBM提升，我们把相邻请求一起规划，比较多条路径的整体代价，再按复用收益决定缓存投入。关键认识是：少搬字节、少一次复制、命中更多，都不一定让总成本更低；必须连同调用费和资源等待一起计算。依据、对照和证据集中在设计依据与优化评述（../02_算法方案/设计依据与优化评述.md）。</w:t>
+      </w:r>
+    </w:p>
+    <w:p>
+      <w:r>
         <w:t>当前源码的公开自动分为89.9792/90；438条输入各三次运行及官方回放通过。较差输入也完整保留，公开成绩不代表隐藏集排名或真实硬件加速。详细结果见验证报告（../05_验证结果/验证报告.md）。</w:t>
       </w:r>
     </w:p>

</xml_diff>

<commit_message>
fix: refine cache admission and document concrete scheduling decisions
Separate idle-time and command savings, account for replacement pressure, and index promotion state. Refresh frozen validation and explain each scheduling decision with formulas and replayed examples.

Signed-off-by: KaisennHu <74917084+KaisennHu@users.noreply.github.com>
</commit_message>
<xml_diff>
--- a/submissions/kaisennhu/00_快速入门/方案介绍.docx
+++ b/submissions/kaisennhu/00_快速入门/方案介绍.docx
@@ -7,7 +7,7 @@
         <w:pStyle w:val="Heading1"/>
       </w:pPr>
       <w:r>
-        <w:t>从零认识NDS方案：任务怎样完成，算法怎样作决定</w:t>
+        <w:t>从零认识NDS调度方案</w:t>
       </w:r>
     </w:p>
     <w:p>
@@ -15,19 +15,517 @@
         <w:pStyle w:val="Heading2"/>
       </w:pPr>
       <w:r>
-        <w:t>一、先建立全貌：当前读取与未来缓存是两个阶段</w:t>
+        <w:t>一、我们要解决什么问题</w:t>
       </w:r>
     </w:p>
     <w:p>
       <w:r>
-        <w:t>这道题研究的是数据搬运。计算卡要使用的数据原本放在SSD上，读取任务陆续到达。程序需要在有限带宽、临时内存和并发名额内，把每份数据送到指定位置。一次完整测试包含一串这样的请求，称为Trace。</w:t>
+        <w:t>计算卡要使用SSD中的数据。读取请求陆续到达，每份请求规定“从哪里读、读多少、写到哪张卡的哪些HBM位置”。一份请求叫IOCB，目标中的每个片段叫iov，一串完整测试请求叫Trace。</w:t>
       </w:r>
     </w:p>
     <w:p>
       <w:r>
-        <w:t>我们的方案围绕两个问题展开：当前的数据怎样搬得划算；读完以后，要不要再付出一次搬运成本，把数据放进缓存，供后续访问使用。 前一个问题由前台调度解决，后一个问题由PROMOTE准入解决。官方模拟器执行计划、判断缓存命中并计分。</w:t>
+        <w:t>我们的程序是搬运调度员：既决定当前数据怎么搬，也决定读完后是否值得再存一份缓存。 官方框架执行计划，管理带宽、内存池和并发，检查正确性并计分。目标是让整条Trace的“时间成本＋CPU调用费＋NPU调用费”尽量低，记作J。</w:t>
       </w:r>
     </w:p>
+    <w:p>
+      <w:r>
+        <w:t>方案有三项决策，彼此衔接：</w:t>
+      </w:r>
+    </w:p>
+    <w:tbl>
+      <w:tblPr>
+        <w:tblStyle w:val="LightShading-Accent1"/>
+        <w:tblW w:type="auto" w:w="0"/>
+        <w:tblLook w:firstColumn="1" w:firstRow="1" w:lastColumn="0" w:lastRow="0" w:noHBand="0" w:noVBand="1" w:val="04A0"/>
+      </w:tblPr>
+      <w:tblGrid>
+        <w:gridCol w:w="3360"/>
+        <w:gridCol w:w="3360"/>
+        <w:gridCol w:w="3360"/>
+      </w:tblGrid>
+      <w:tr>
+        <w:tc>
+          <w:tcPr>
+            <w:tcW w:type="dxa" w:w="3360"/>
+          </w:tcPr>
+          <w:p>
+            <w:r>
+              <w:rPr>
+                <w:sz w:val="18"/>
+              </w:rPr>
+              <w:t>要回答的问题</w:t>
+            </w:r>
+          </w:p>
+        </w:tc>
+        <w:tc>
+          <w:tcPr>
+            <w:tcW w:type="dxa" w:w="3360"/>
+          </w:tcPr>
+          <w:p>
+            <w:r>
+              <w:rPr>
+                <w:sz w:val="18"/>
+              </w:rPr>
+              <w:t>具体做法</w:t>
+            </w:r>
+          </w:p>
+        </w:tc>
+        <w:tc>
+          <w:tcPr>
+            <w:tcW w:type="dxa" w:w="3360"/>
+          </w:tcPr>
+          <w:p>
+            <w:r>
+              <w:rPr>
+                <w:sz w:val="18"/>
+              </w:rPr>
+              <w:t>期望减少什么</w:t>
+            </w:r>
+          </w:p>
+        </w:tc>
+      </w:tr>
+      <w:tr>
+        <w:tc>
+          <w:tcPr>
+            <w:tcW w:type="dxa" w:w="3360"/>
+          </w:tcPr>
+          <w:p>
+            <w:r>
+              <w:rPr>
+                <w:sz w:val="18"/>
+              </w:rPr>
+              <w:t>哪些请求一起搬，走哪条路？</w:t>
+            </w:r>
+          </w:p>
+        </w:tc>
+        <w:tc>
+          <w:tcPr>
+            <w:tcW w:type="dxa" w:w="3360"/>
+          </w:tcPr>
+          <w:p>
+            <w:r>
+              <w:rPr>
+                <w:sz w:val="18"/>
+              </w:rPr>
+              <w:t>把同卡、相邻或重叠的片段排好，比较不同分组与合法路径</w:t>
+            </w:r>
+          </w:p>
+        </w:tc>
+        <w:tc>
+          <w:tcPr>
+            <w:tcW w:type="dxa" w:w="3360"/>
+          </w:tcPr>
+          <w:p>
+            <w:r>
+              <w:rPr>
+                <w:sz w:val="18"/>
+              </w:rPr>
+              <w:t>重复读取、固定操作费和复制调用</w:t>
+            </w:r>
+          </w:p>
+        </w:tc>
+      </w:tr>
+      <w:tr>
+        <w:tc>
+          <w:tcPr>
+            <w:tcW w:type="dxa" w:w="3360"/>
+          </w:tcPr>
+          <w:p>
+            <w:r>
+              <w:rPr>
+                <w:sz w:val="18"/>
+              </w:rPr>
+              <w:t>几组操作一起执行还划算吗？</w:t>
+            </w:r>
+          </w:p>
+        </w:tc>
+        <w:tc>
+          <w:tcPr>
+            <w:tcW w:type="dxa" w:w="3360"/>
+          </w:tcPr>
+          <w:p>
+            <w:r>
+              <w:rPr>
+                <w:sz w:val="18"/>
+              </w:rPr>
+              <w:t>把少量完整计划放到已见请求窗口中试算，选估计J更低者</w:t>
+            </w:r>
+          </w:p>
+        </w:tc>
+        <w:tc>
+          <w:tcPr>
+            <w:tcW w:type="dxa" w:w="3360"/>
+          </w:tcPr>
+          <w:p>
+            <w:r>
+              <w:rPr>
+                <w:sz w:val="18"/>
+              </w:rPr>
+              <w:t>槽位、缓冲和并发竞争带来的等待</w:t>
+            </w:r>
+          </w:p>
+        </w:tc>
+      </w:tr>
+      <w:tr>
+        <w:tc>
+          <w:tcPr>
+            <w:tcW w:type="dxa" w:w="3360"/>
+          </w:tcPr>
+          <w:p>
+            <w:r>
+              <w:rPr>
+                <w:sz w:val="18"/>
+              </w:rPr>
+              <w:t>读完后要不要缓存？</w:t>
+            </w:r>
+          </w:p>
+        </w:tc>
+        <w:tc>
+          <w:tcPr>
+            <w:tcW w:type="dxa" w:w="3360"/>
+          </w:tcPr>
+          <w:p>
+            <w:r>
+              <w:rPr>
+                <w:sz w:val="18"/>
+              </w:rPr>
+              <w:t>要有跨时刻重复，命中有净收益，历史预算也足够</w:t>
+            </w:r>
+          </w:p>
+        </w:tc>
+        <w:tc>
+          <w:tcPr>
+            <w:tcW w:type="dxa" w:w="3360"/>
+          </w:tcPr>
+          <w:p>
+            <w:r>
+              <w:rPr>
+                <w:sz w:val="18"/>
+              </w:rPr>
+              <w:t>没有后续收益的PROMOTE投入</w:t>
+            </w:r>
+          </w:p>
+        </w:tc>
+      </w:tr>
+    </w:tbl>
+    <w:p>
+      <w:r>
+        <w:t>这些判断都只使用当前请求、历史记录和可见状态，不知道未来访问。</w:t>
+      </w:r>
+    </w:p>
+    <w:p>
+      <w:pPr>
+        <w:pStyle w:val="Heading2"/>
+      </w:pPr>
+      <w:r>
+        <w:t>二、一批请求从到达到完成，经过哪些步骤</w:t>
+      </w:r>
+    </w:p>
+    <w:p>
+      <w:r>
+        <w:t>先认识三条前台路径：DIRECT直接从SSD到目标HBM；AGGREGATE先到临时HBM再做卡内复制；FALLBACK先到DDR再复制到卡。多一步复制可能换来更好的资源利用，因此算法不固定认定某条路径永远最好。</w:t>
+      </w:r>
+    </w:p>
+    <w:tbl>
+      <w:tblPr>
+        <w:tblStyle w:val="LightShading-Accent1"/>
+        <w:tblW w:type="auto" w:w="0"/>
+        <w:tblLook w:firstColumn="1" w:firstRow="1" w:lastColumn="0" w:lastRow="0" w:noHBand="0" w:noVBand="1" w:val="04A0"/>
+      </w:tblPr>
+      <w:tblGrid>
+        <w:gridCol w:w="3360"/>
+        <w:gridCol w:w="3360"/>
+        <w:gridCol w:w="3360"/>
+      </w:tblGrid>
+      <w:tr>
+        <w:tc>
+          <w:tcPr>
+            <w:tcW w:type="dxa" w:w="3360"/>
+          </w:tcPr>
+          <w:p>
+            <w:r>
+              <w:rPr>
+                <w:sz w:val="18"/>
+              </w:rPr>
+              <w:t>顺序</w:t>
+            </w:r>
+          </w:p>
+        </w:tc>
+        <w:tc>
+          <w:tcPr>
+            <w:tcW w:type="dxa" w:w="3360"/>
+          </w:tcPr>
+          <w:p>
+            <w:r>
+              <w:rPr>
+                <w:sz w:val="18"/>
+              </w:rPr>
+              <w:t>谁执行</w:t>
+            </w:r>
+          </w:p>
+        </w:tc>
+        <w:tc>
+          <w:tcPr>
+            <w:tcW w:type="dxa" w:w="3360"/>
+          </w:tcPr>
+          <w:p>
+            <w:r>
+              <w:rPr>
+                <w:sz w:val="18"/>
+              </w:rPr>
+              <w:t>做什么、得到什么</w:t>
+            </w:r>
+          </w:p>
+        </w:tc>
+      </w:tr>
+      <w:tr>
+        <w:tc>
+          <w:tcPr>
+            <w:tcW w:type="dxa" w:w="3360"/>
+          </w:tcPr>
+          <w:p>
+            <w:r>
+              <w:rPr>
+                <w:sz w:val="18"/>
+              </w:rPr>
+              <w:t>1. 查缓存</w:t>
+            </w:r>
+          </w:p>
+        </w:tc>
+        <w:tc>
+          <w:tcPr>
+            <w:tcW w:type="dxa" w:w="3360"/>
+          </w:tcPr>
+          <w:p>
+            <w:r>
+              <w:rPr>
+                <w:sz w:val="18"/>
+              </w:rPr>
+              <w:t>框架</w:t>
+            </w:r>
+          </w:p>
+        </w:tc>
+        <w:tc>
+          <w:tcPr>
+            <w:tcW w:type="dxa" w:w="3360"/>
+          </w:tcPr>
+          <w:p>
+            <w:r>
+              <w:rPr>
+                <w:sz w:val="18"/>
+              </w:rPr>
+              <w:t>已缓存且有效的完整同键请求，自动从KV池H2D到目标HBM；其余交给策略</w:t>
+            </w:r>
+          </w:p>
+        </w:tc>
+      </w:tr>
+      <w:tr>
+        <w:tc>
+          <w:tcPr>
+            <w:tcW w:type="dxa" w:w="3360"/>
+          </w:tcPr>
+          <w:p>
+            <w:r>
+              <w:rPr>
+                <w:sz w:val="18"/>
+              </w:rPr>
+              <w:t>2. 整理与切块</w:t>
+            </w:r>
+          </w:p>
+        </w:tc>
+        <w:tc>
+          <w:tcPr>
+            <w:tcW w:type="dxa" w:w="3360"/>
+          </w:tcPr>
+          <w:p>
+            <w:r>
+              <w:rPr>
+                <w:sz w:val="18"/>
+              </w:rPr>
+              <w:t>策略</w:t>
+            </w:r>
+          </w:p>
+        </w:tc>
+        <w:tc>
+          <w:tcPr>
+            <w:tcW w:type="dxa" w:w="3360"/>
+          </w:tcPr>
+          <w:p>
+            <w:r>
+              <w:rPr>
+                <w:sz w:val="18"/>
+              </w:rPr>
+              <w:t>标出数据到目标的映射；过大的请求按临时池容量切成可搬运片段</w:t>
+            </w:r>
+          </w:p>
+        </w:tc>
+      </w:tr>
+      <w:tr>
+        <w:tc>
+          <w:tcPr>
+            <w:tcW w:type="dxa" w:w="3360"/>
+          </w:tcPr>
+          <w:p>
+            <w:r>
+              <w:rPr>
+                <w:sz w:val="18"/>
+              </w:rPr>
+              <w:t>3. 比较分组和路径</w:t>
+            </w:r>
+          </w:p>
+        </w:tc>
+        <w:tc>
+          <w:tcPr>
+            <w:tcW w:type="dxa" w:w="3360"/>
+          </w:tcPr>
+          <w:p>
+            <w:r>
+              <w:rPr>
+                <w:sz w:val="18"/>
+              </w:rPr>
+              <w:t>策略</w:t>
+            </w:r>
+          </w:p>
+        </w:tc>
+        <w:tc>
+          <w:tcPr>
+            <w:tcW w:type="dxa" w:w="3360"/>
+          </w:tcPr>
+          <w:p>
+            <w:r>
+              <w:rPr>
+                <w:sz w:val="18"/>
+              </w:rPr>
+              <w:t>排除不合法候选，按SSD工作、复制工作和调用费估价；选累计估价较低的组合</w:t>
+            </w:r>
+          </w:p>
+        </w:tc>
+      </w:tr>
+      <w:tr>
+        <w:tc>
+          <w:tcPr>
+            <w:tcW w:type="dxa" w:w="3360"/>
+          </w:tcPr>
+          <w:p>
+            <w:r>
+              <w:rPr>
+                <w:sz w:val="18"/>
+              </w:rPr>
+              <w:t>4. 比较完整计划</w:t>
+            </w:r>
+          </w:p>
+        </w:tc>
+        <w:tc>
+          <w:tcPr>
+            <w:tcW w:type="dxa" w:w="3360"/>
+          </w:tcPr>
+          <w:p>
+            <w:r>
+              <w:rPr>
+                <w:sz w:val="18"/>
+              </w:rPr>
+              <w:t>策略</w:t>
+            </w:r>
+          </w:p>
+        </w:tc>
+        <w:tc>
+          <w:tcPr>
+            <w:tcW w:type="dxa" w:w="3360"/>
+          </w:tcPr>
+          <w:p>
+            <w:r>
+              <w:rPr>
+                <w:sz w:val="18"/>
+              </w:rPr>
+              <w:t>小批可枚举，普通批比较少量块长和路径组合；输入过大则保留快速规划结果</w:t>
+            </w:r>
+          </w:p>
+        </w:tc>
+      </w:tr>
+      <w:tr>
+        <w:tc>
+          <w:tcPr>
+            <w:tcW w:type="dxa" w:w="3360"/>
+          </w:tcPr>
+          <w:p>
+            <w:r>
+              <w:rPr>
+                <w:sz w:val="18"/>
+              </w:rPr>
+              <w:t>5. 执行当前读取</w:t>
+            </w:r>
+          </w:p>
+        </w:tc>
+        <w:tc>
+          <w:tcPr>
+            <w:tcW w:type="dxa" w:w="3360"/>
+          </w:tcPr>
+          <w:p>
+            <w:r>
+              <w:rPr>
+                <w:sz w:val="18"/>
+              </w:rPr>
+              <w:t>框架</w:t>
+            </w:r>
+          </w:p>
+        </w:tc>
+        <w:tc>
+          <w:tcPr>
+            <w:tcW w:type="dxa" w:w="3360"/>
+          </w:tcPr>
+          <w:p>
+            <w:r>
+              <w:rPr>
+                <w:sz w:val="18"/>
+              </w:rPr>
+              <w:t>按计划读SSD、复制到各目标，复制必须等对应SSD读取完成</w:t>
+            </w:r>
+          </w:p>
+        </w:tc>
+      </w:tr>
+      <w:tr>
+        <w:tc>
+          <w:tcPr>
+            <w:tcW w:type="dxa" w:w="3360"/>
+          </w:tcPr>
+          <w:p>
+            <w:r>
+              <w:rPr>
+                <w:sz w:val="18"/>
+              </w:rPr>
+              <w:t>6. 判断是否PROMOTE</w:t>
+            </w:r>
+          </w:p>
+        </w:tc>
+        <w:tc>
+          <w:tcPr>
+            <w:tcW w:type="dxa" w:w="3360"/>
+          </w:tcPr>
+          <w:p>
+            <w:r>
+              <w:rPr>
+                <w:sz w:val="18"/>
+              </w:rPr>
+              <w:t>策略</w:t>
+            </w:r>
+          </w:p>
+        </w:tc>
+        <w:tc>
+          <w:tcPr>
+            <w:tcW w:type="dxa" w:w="3360"/>
+          </w:tcPr>
+          <w:p>
+            <w:r>
+              <w:rPr>
+                <w:sz w:val="18"/>
+              </w:rPr>
+              <w:t>每份IOCB完整完成后，检查复用、收益和预算；通过才额外搬入KV池</w:t>
+            </w:r>
+          </w:p>
+        </w:tc>
+      </w:tr>
+    </w:tbl>
     <w:p>
       <w:r>
         <w:drawing>
@@ -69,17 +567,12 @@
         <w:pStyle w:val="Caption"/>
       </w:pPr>
       <w:r>
-        <w:t>总体流程：先安排当前读取，完成后再判断缓存</w:t>
+        <w:t>读取与缓存的两个决策阶段</w:t>
       </w:r>
     </w:p>
     <w:p>
       <w:r>
-        <w:t>当一批请求到达，框架先查缓存。命中的请求直接由框架搬运；未命中的请求交给我们，经过“整理与分块→比较合并和路径→观察窗口比较→提交计划”。单个请求读完后，框架再调用我们，检查是否值得PROMOTE。两条流程在整个Trace内反复发生，并非先读完整条Trace、最后统一缓存。</w:t>
-      </w:r>
-    </w:p>
-    <w:p>
-      <w:r>
-        <w:t>读者可以把这个程序理解为调度员：它制定搬运方案，既不能改客户什么时候下单，也不能自己宣布运输已完成。最后耗时和费用由模拟器独立核算。</w:t>
+        <w:t>这里有两个容易混淆的点。第一，多个IOCB可以共享一个操作，但仍分别接收各自的数据。第二，PROMOTE服务未来访问，本次IOCB在发起它之前已经完成；不用等整条Trace读完才统一提升。前一个请求提升时，后一个请求可以继续到达。</w:t>
       </w:r>
     </w:p>
     <w:p>
@@ -87,7 +580,434 @@
         <w:pStyle w:val="Heading2"/>
       </w:pPr>
       <w:r>
-        <w:t>二、理解流程需要的基本概念</w:t>
+        <w:t>三、用实际数字理解：为什么不是“尽量合并”</w:t>
+      </w:r>
+    </w:p>
+    <w:p>
+      <w:r>
+        <w:t>先看三个同卡、相邻的512B请求，源和目标都对齐。程序把它们合成一条1536B DIRECT传输。官方模拟器结果是：</w:t>
+      </w:r>
+    </w:p>
+    <w:tbl>
+      <w:tblPr>
+        <w:tblStyle w:val="LightShading-Accent1"/>
+        <w:tblW w:type="auto" w:w="0"/>
+        <w:tblLook w:firstColumn="1" w:firstRow="1" w:lastColumn="0" w:lastRow="0" w:noHBand="0" w:noVBand="1" w:val="04A0"/>
+      </w:tblPr>
+      <w:tblGrid>
+        <w:gridCol w:w="2016"/>
+        <w:gridCol w:w="2016"/>
+        <w:gridCol w:w="2016"/>
+        <w:gridCol w:w="2016"/>
+        <w:gridCol w:w="2016"/>
+      </w:tblGrid>
+      <w:tr>
+        <w:tc>
+          <w:tcPr>
+            <w:tcW w:type="dxa" w:w="2016"/>
+          </w:tcPr>
+          <w:p>
+            <w:r>
+              <w:rPr>
+                <w:sz w:val="18"/>
+              </w:rPr>
+              <w:t>方案</w:t>
+            </w:r>
+          </w:p>
+        </w:tc>
+        <w:tc>
+          <w:tcPr>
+            <w:tcW w:type="dxa" w:w="2016"/>
+          </w:tcPr>
+          <w:p>
+            <w:r>
+              <w:rPr>
+                <w:sz w:val="18"/>
+              </w:rPr>
+              <w:t>总时间</w:t>
+            </w:r>
+          </w:p>
+        </w:tc>
+        <w:tc>
+          <w:tcPr>
+            <w:tcW w:type="dxa" w:w="2016"/>
+          </w:tcPr>
+          <w:p>
+            <w:r>
+              <w:rPr>
+                <w:sz w:val="18"/>
+              </w:rPr>
+              <w:t>CPU费</w:t>
+            </w:r>
+          </w:p>
+        </w:tc>
+        <w:tc>
+          <w:tcPr>
+            <w:tcW w:type="dxa" w:w="2016"/>
+          </w:tcPr>
+          <w:p>
+            <w:r>
+              <w:rPr>
+                <w:sz w:val="18"/>
+              </w:rPr>
+              <w:t>NPU费</w:t>
+            </w:r>
+          </w:p>
+        </w:tc>
+        <w:tc>
+          <w:tcPr>
+            <w:tcW w:type="dxa" w:w="2016"/>
+          </w:tcPr>
+          <w:p>
+            <w:r>
+              <w:rPr>
+                <w:sz w:val="18"/>
+              </w:rPr>
+              <w:t>J</w:t>
+            </w:r>
+          </w:p>
+        </w:tc>
+      </w:tr>
+      <w:tr>
+        <w:tc>
+          <w:tcPr>
+            <w:tcW w:type="dxa" w:w="2016"/>
+          </w:tcPr>
+          <w:p>
+            <w:r>
+              <w:rPr>
+                <w:sz w:val="18"/>
+              </w:rPr>
+              <w:t>三次独立DIRECT</w:t>
+            </w:r>
+          </w:p>
+        </w:tc>
+        <w:tc>
+          <w:tcPr>
+            <w:tcW w:type="dxa" w:w="2016"/>
+          </w:tcPr>
+          <w:p>
+            <w:r>
+              <w:rPr>
+                <w:sz w:val="18"/>
+              </w:rPr>
+              <w:t>4微秒</w:t>
+            </w:r>
+          </w:p>
+        </w:tc>
+        <w:tc>
+          <w:tcPr>
+            <w:tcW w:type="dxa" w:w="2016"/>
+          </w:tcPr>
+          <w:p>
+            <w:r>
+              <w:rPr>
+                <w:sz w:val="18"/>
+              </w:rPr>
+              <w:t>6</w:t>
+            </w:r>
+          </w:p>
+        </w:tc>
+        <w:tc>
+          <w:tcPr>
+            <w:tcW w:type="dxa" w:w="2016"/>
+          </w:tcPr>
+          <w:p>
+            <w:r>
+              <w:rPr>
+                <w:sz w:val="18"/>
+              </w:rPr>
+              <w:t>0</w:t>
+            </w:r>
+          </w:p>
+        </w:tc>
+        <w:tc>
+          <w:tcPr>
+            <w:tcW w:type="dxa" w:w="2016"/>
+          </w:tcPr>
+          <w:p>
+            <w:r>
+              <w:rPr>
+                <w:sz w:val="18"/>
+              </w:rPr>
+              <w:t>10</w:t>
+            </w:r>
+          </w:p>
+        </w:tc>
+      </w:tr>
+      <w:tr>
+        <w:tc>
+          <w:tcPr>
+            <w:tcW w:type="dxa" w:w="2016"/>
+          </w:tcPr>
+          <w:p>
+            <w:r>
+              <w:rPr>
+                <w:sz w:val="18"/>
+              </w:rPr>
+              <w:t>一次合并DIRECT，实际选中</w:t>
+            </w:r>
+          </w:p>
+        </w:tc>
+        <w:tc>
+          <w:tcPr>
+            <w:tcW w:type="dxa" w:w="2016"/>
+          </w:tcPr>
+          <w:p>
+            <w:r>
+              <w:rPr>
+                <w:sz w:val="18"/>
+              </w:rPr>
+              <w:t>4微秒</w:t>
+            </w:r>
+          </w:p>
+        </w:tc>
+        <w:tc>
+          <w:tcPr>
+            <w:tcW w:type="dxa" w:w="2016"/>
+          </w:tcPr>
+          <w:p>
+            <w:r>
+              <w:rPr>
+                <w:sz w:val="18"/>
+              </w:rPr>
+              <w:t>2</w:t>
+            </w:r>
+          </w:p>
+        </w:tc>
+        <w:tc>
+          <w:tcPr>
+            <w:tcW w:type="dxa" w:w="2016"/>
+          </w:tcPr>
+          <w:p>
+            <w:r>
+              <w:rPr>
+                <w:sz w:val="18"/>
+              </w:rPr>
+              <w:t>0</w:t>
+            </w:r>
+          </w:p>
+        </w:tc>
+        <w:tc>
+          <w:tcPr>
+            <w:tcW w:type="dxa" w:w="2016"/>
+          </w:tcPr>
+          <w:p>
+            <w:r>
+              <w:rPr>
+                <w:sz w:val="18"/>
+              </w:rPr>
+              <w:t>6</w:t>
+            </w:r>
+          </w:p>
+        </w:tc>
+      </w:tr>
+    </w:tbl>
+    <w:p>
+      <w:r>
+        <w:t>时间没变，但少建两组操作、少发两条SSD命令，成本下降。这就是合并的价值。</w:t>
+      </w:r>
+    </w:p>
+    <w:p>
+      <w:r>
+        <w:t>再把每份数据改成4KiB，目标地址改为不满足512B对齐，DIRECT不可用。此时，合成一个AGGREGATE的J为98，分成三个AGGREGATE的J却只有48：合并少付了调用费，却减少了复制并发，在该性能模型下把时间从33微秒拉长到93微秒。程序选择分开执行。</w:t>
+      </w:r>
+    </w:p>
+    <w:p>
+      <w:r>
+        <w:t>算法优化的是J，不是操作数最少、并发最多或路径最短。 上述两个例子来自当前程序及官方回放，输入、输出与候选对照（../02_算法方案/示例/）均可查看。详细的分组条件、估价公式、动态规划和候选比较见算法设计（../02_算法方案/算法设计.md）。</w:t>
+      </w:r>
+    </w:p>
+    <w:p>
+      <w:pPr>
+        <w:pStyle w:val="Heading2"/>
+      </w:pPr>
+      <w:r>
+        <w:t>四、读完之后，什么情况下会缓存</w:t>
+      </w:r>
+    </w:p>
+    <w:p>
+      <w:r>
+        <w:t>PROMOTE需要额外传输和固定费用；缓存命中也要H2D复制并收费。因此，看到第二次请求不代表一定缓存。程序依次判断：</w:t>
+      </w:r>
+    </w:p>
+    <w:tbl>
+      <w:tblPr>
+        <w:tblStyle w:val="LightShading-Accent1"/>
+        <w:tblW w:type="auto" w:w="0"/>
+        <w:tblLook w:firstColumn="1" w:firstRow="1" w:lastColumn="0" w:lastRow="0" w:noHBand="0" w:noVBand="1" w:val="04A0"/>
+      </w:tblPr>
+      <w:tblGrid>
+        <w:gridCol w:w="5040"/>
+        <w:gridCol w:w="5040"/>
+      </w:tblGrid>
+      <w:tr>
+        <w:tc>
+          <w:tcPr>
+            <w:tcW w:type="dxa" w:w="5040"/>
+          </w:tcPr>
+          <w:p>
+            <w:r>
+              <w:rPr>
+                <w:sz w:val="18"/>
+              </w:rPr>
+              <w:t>判断</w:t>
+            </w:r>
+          </w:p>
+        </w:tc>
+        <w:tc>
+          <w:tcPr>
+            <w:tcW w:type="dxa" w:w="5040"/>
+          </w:tcPr>
+          <w:p>
+            <w:r>
+              <w:rPr>
+                <w:sz w:val="18"/>
+              </w:rPr>
+              <w:t>不通过时怎样处理</w:t>
+            </w:r>
+          </w:p>
+        </w:tc>
+      </w:tr>
+      <w:tr>
+        <w:tc>
+          <w:tcPr>
+            <w:tcW w:type="dxa" w:w="5040"/>
+          </w:tcPr>
+          <w:p>
+            <w:r>
+              <w:rPr>
+                <w:sz w:val="18"/>
+              </w:rPr>
+              <w:t>同键是否在不同时刻再次出现，最近需求是否仍新鲜？</w:t>
+            </w:r>
+          </w:p>
+        </w:tc>
+        <w:tc>
+          <w:tcPr>
+            <w:tcW w:type="dxa" w:w="5040"/>
+          </w:tcPr>
+          <w:p>
+            <w:r>
+              <w:rPr>
+                <w:sz w:val="18"/>
+              </w:rPr>
+              <w:t>继续正常读取，不为过时或一次性数据缓存</w:t>
+            </w:r>
+          </w:p>
+        </w:tc>
+      </w:tr>
+      <w:tr>
+        <w:tc>
+          <w:tcPr>
+            <w:tcW w:type="dxa" w:w="5040"/>
+          </w:tcPr>
+          <w:p>
+            <w:r>
+              <w:rPr>
+                <w:sz w:val="18"/>
+              </w:rPr>
+              <w:t>对象是否放得进整个池，是否已经在提升或缺少再次未命中证据？</w:t>
+            </w:r>
+          </w:p>
+        </w:tc>
+        <w:tc>
+          <w:tcPr>
+            <w:tcW w:type="dxa" w:w="5040"/>
+          </w:tcPr>
+          <w:p>
+            <w:r>
+              <w:rPr>
+                <w:sz w:val="18"/>
+              </w:rPr>
+              <w:t>不重复投入</w:t>
+            </w:r>
+          </w:p>
+        </w:tc>
+      </w:tr>
+      <w:tr>
+        <w:tc>
+          <w:tcPr>
+            <w:tcW w:type="dxa" w:w="5040"/>
+          </w:tcPr>
+          <w:p>
+            <w:r>
+              <w:rPr>
+                <w:sz w:val="18"/>
+              </w:rPr>
+              <w:t>估计一次命中，能否省下更多时间或调用费？</w:t>
+            </w:r>
+          </w:p>
+        </w:tc>
+        <w:tc>
+          <w:tcPr>
+            <w:tcW w:type="dxa" w:w="5040"/>
+          </w:tcPr>
+          <w:p>
+            <w:r>
+              <w:rPr>
+                <w:sz w:val="18"/>
+              </w:rPr>
+              <w:t>净收益≤0就不提升</w:t>
+            </w:r>
+          </w:p>
+        </w:tc>
+      </w:tr>
+      <w:tr>
+        <w:tc>
+          <w:tcPr>
+            <w:tcW w:type="dxa" w:w="5040"/>
+          </w:tcPr>
+          <w:p>
+            <w:r>
+              <w:rPr>
+                <w:sz w:val="18"/>
+              </w:rPr>
+              <w:t>已观察读取形成的预算，是否覆盖提升成本和容量压力？</w:t>
+            </w:r>
+          </w:p>
+        </w:tc>
+        <w:tc>
+          <w:tcPr>
+            <w:tcW w:type="dxa" w:w="5040"/>
+          </w:tcPr>
+          <w:p>
+            <w:r>
+              <w:rPr>
+                <w:sz w:val="18"/>
+              </w:rPr>
+              <w:t>预算不足就继续积累，不立即提升</w:t>
+            </w:r>
+          </w:p>
+        </w:tc>
+      </w:tr>
+    </w:tbl>
+    <w:p>
+      <w:r>
+        <w:t>时间收益与调用费收益分开算。如果两批之间很空闲，读快一点可能只是多空闲一会，整条Trace结束时刻未必提前；此时不计预期时间收益。但非对齐读取的调用费仍可能比一次命中更高，这部分收益保留。</w:t>
+      </w:r>
+    </w:p>
+    <w:p>
+      <w:r>
+        <w:t>预算可以理解为“已观察到多少重复读取支出，是否足以支持一次额外投入”。它不是现金，也不是对未来命中次数的保证。例如提升成本估计100、容量压力使门槛升到112.5：已有预算104时先不提升，后续新鲜读取把预算增加到156后才提升。公式和逐项计算在算法设计的缓存算例（../02_算法方案/算法设计.md）中展开。</w:t>
+      </w:r>
+    </w:p>
+    <w:p>
+      <w:r>
+        <w:t>确定提升时，程序比较从源卡HBM复制与从SSD重读的成本，选择来源并允许从当前时刻开始。成功入池后，后续同卡、同SSD起点、同长度请求才可能命中。满池时允许有足够证据的新热点替换旧对象；实际TTL失效和LRU驱逐由框架执行。</w:t>
+      </w:r>
+    </w:p>
+    <w:p>
+      <w:r>
+        <w:t>因此，方案的完整闭环是：先安排本次读取，再用选中计划估计缓存价值；缓存改变下一批的命中与资源状态，下一批继续按同一规则处理。 它可能误判热点停止或突变，不能保证每次提升都回本。</w:t>
+      </w:r>
+    </w:p>
+    <w:p>
+      <w:pPr>
+        <w:pStyle w:val="Heading2"/>
+      </w:pPr>
+      <w:r>
+        <w:t>五、按需查阅：术语、规则与计费</w:t>
       </w:r>
     </w:p>
     <w:p>
@@ -95,7 +1015,7 @@
         <w:pStyle w:val="Heading3"/>
       </w:pPr>
       <w:r>
-        <w:t>2.1 数据在哪里，任务如何表达</w:t>
+        <w:t>5.1 数据在哪里，任务如何表达</w:t>
       </w:r>
     </w:p>
     <w:tbl>
@@ -376,7 +1296,7 @@
         <w:pStyle w:val="Heading3"/>
       </w:pPr>
       <w:r>
-        <w:t>2.2 三条前台路径与两种后台来源</w:t>
+        <w:t>5.2 三条前台路径与两种后台来源</w:t>
       </w:r>
     </w:p>
     <w:tbl>
@@ -680,6 +1600,11 @@
     </w:tbl>
     <w:p>
       <w:r>
+        <w:t>扩读比是“实际SSD读取字节数÷本次请求需要的字节数”。例如从偏移100读取584字节，需要范围[100,684)，按512B边界扩展为[0,1024)，扩读比约1.75，即多读约75%；目标HBM仍只写需要的584字节。baseline使用的1.5是选路经验门槛，不是合法上限。整条Trace的read_amplification还受缓存命中和共享重叠读取影响，可能小于1，不能与单次对齐扩读比混用。</w:t>
+      </w:r>
+    </w:p>
+    <w:p>
+      <w:r>
         <w:t>三条前台路径都可以组织多个同卡请求，是否能合并取决于对齐、范围、容量等约束。合并决定“哪些数据由一组操作服务”，并发决定“哪些传输同时执行”。把三次小读取变成一次大读取，不等于增加了三个并发。</w:t>
       </w:r>
     </w:p>
@@ -703,7 +1628,7 @@
         <w:pStyle w:val="Heading3"/>
       </w:pPr>
       <w:r>
-        <w:t>2.3 综合成本J怎样算，固定费用又是什么</w:t>
+        <w:t>5.3 综合成本J怎样算，固定费用又是什么</w:t>
       </w:r>
     </w:p>
     <w:p>
@@ -1249,119 +2174,22 @@
         <w:pStyle w:val="Heading2"/>
       </w:pPr>
       <w:r>
-        <w:t>三、沿着一次读取理解算法</w:t>
-      </w:r>
-    </w:p>
-    <w:p>
-      <w:pPr>
-        <w:pStyle w:val="Heading3"/>
-      </w:pPr>
-      <w:r>
-        <w:t>3.1 到达时先生成合法前台方案，再比较整体竞争</w:t>
+        <w:t>六、结果与阅读、运行入口</w:t>
       </w:r>
     </w:p>
     <w:p>
       <w:r>
-        <w:t>策略首先建立“SSD片段应该写到哪个HBM位置”的索引，并记录当前资源活动。大请求按容量切成块，不能DIRECT的片段按512B边界安排物理读取，复制时只写真正需要的数据。</w:t>
+        <w:t>当前公开39条输入自动分89.9899/90，官方贪心为67.1981/90；481条输入各三次运行与官方回放通过。220条扩展对照仍有26条比贪心更差。当前源码冻结后的24条新组合中14条更优、10条更差，最大回退3.35%；不把公开成绩解释为每例必胜或真实硬件加速。</w:t>
       </w:r>
     </w:p>
     <w:p>
       <w:r>
-        <w:t>接着把同卡、相接或重叠的SSD片段排在一起。区间动态规划同时比较“怎么分组”和“每组走哪条路径”。动态规划在这里就是反复比较不同分组边界，保留前面一段片段累计估计成本更低的组合，不是提前知道后续Trace。</w:t>
+        <w:t>接着读算法设计（../02_算法方案/算法设计.md），看每步具体输入、条件、公式、输出与数值例子；设计依据与优化评述（../02_算法方案/设计依据与优化评述.md）解释为何这样设计、比baseline改进在哪里；验证报告（../05_验证结果/验证报告.md）给出证据与回退。</w:t>
       </w:r>
     </w:p>
     <w:p>
       <w:r>
-        <w:t>逐组看起来便宜的计划，整体执行时仍可能卡在槽位和缓冲池上。因此普通规模输入还会比较少量不同块长、不同路径偏好的完整计划。比较窗口只包含当前和有限已见批次，并省略部分后台活动，属于近似。最后只提交当前批次的计划，过去已经提交的任务不会被改写。</w:t>
-      </w:r>
-    </w:p>
-    <w:p>
-      <w:pPr>
-        <w:pStyle w:val="Heading3"/>
-      </w:pPr>
-      <w:r>
-        <w:t>3.2 完成后先检查是否值得缓存，再选择来源</w:t>
-      </w:r>
-    </w:p>
-    <w:p>
-      <w:r>
-        <w:t>前台读取完成后，策略检查对象是否出现过跨时刻复用、是否放得下、最近需求是否仍然新鲜，以及是否已经缓存或正在提升。随后比较未来一次命中能省下的读取成本与命中自身H2D成本，要求净收益为正。</w:t>
-      </w:r>
-    </w:p>
-    <w:p>
-      <w:r>
-        <w:t>程序还用已经观察到的读取工作量形成提升预算，预算足够才投入PROMOTE。这样不用假定未来一定会命中很多次。它仍然可能判断错：同一段已见历史，后续既可能持续复用，也可能突然停止。</w:t>
-      </w:r>
-    </w:p>
-    <w:p>
-      <w:r>
-        <w:t>决定提升时，可以从HBM复制，也可以从SSD重新读入缓存池。当前实现比较对应的资源压力后选择来源，允许从当前时刻开始并设置较低优先级。实际是否立刻执行由框架决定。提升完成并插入缓存后，后续完整同键请求才可能命中。</w:t>
-      </w:r>
-    </w:p>
-    <w:p>
-      <w:pPr>
-        <w:pStyle w:val="Heading2"/>
-      </w:pPr>
-      <w:r>
-        <w:t>四、把前台和缓存连成一个完整例子</w:t>
-      </w:r>
-    </w:p>
-    <w:p>
-      <w:r>
-        <w:t>假设A、B、C是同卡、相邻SSD区间上的三个4KiB请求，目标HBM片段不满足DIRECT对齐。第一次到达时，它们都不在KV池中。以下假设比较结果选择合并FALLBACK，只用于说明流程。</w:t>
-      </w:r>
-    </w:p>
-    <w:p>
-      <w:r>
-        <w:t>程序先将三个请求组织为一项操作：一次读取12KiB到DDR，再用一次多目标H2D把三份4KiB分别写入各自目标。三个请求仍各自完成，但共享读取和复制的组织开销。此时CPU成本为11、NPU成本为1，再结合实际历时计入J。</w:t>
-      </w:r>
-    </w:p>
-    <w:p>
-      <w:r>
-        <w:t>第一次完成时没有充分复用证据，程序不提升。后来A的数据再次出现，完成后若复用、新鲜度、收益和预算都满足条件，就为A这个完整请求发起PROMOTE。合并读取过的B、C不会因此自动进入缓存。</w:t>
-      </w:r>
-    </w:p>
-    <w:p>
-      <w:r>
-        <w:t>A的提升执行期间，其他请求仍可继续到达和搬运。如果提升尚未完成，新的A请求仍可能未命中；提升成功且未失效后，再次出现的完整同键A请求则由框架从缓存池复制到目标HBM。它省去了SSD读取，却仍消耗H2D和调用成本，并向策略提供完成反馈。</w:t>
-      </w:r>
-    </w:p>
-    <w:p>
-      <w:r>
-        <w:t>这就是两个阶段的联系：前台决定当前这次工作怎样完成，后台决定是否为未来重复工作付出额外成本；下一批请求又会在变化后的缓存和资源状态下进入同一流程。</w:t>
-      </w:r>
-    </w:p>
-    <w:p>
-      <w:pPr>
-        <w:pStyle w:val="Heading2"/>
-      </w:pPr>
-      <w:r>
-        <w:t>五、如何阅读和验证这套方案</w:t>
-      </w:r>
-    </w:p>
-    <w:p>
-      <w:r>
-        <w:t>本方案不是某条路径或缓存规则单独取胜，而是让分组、路径、资源竞争和缓存投入使用同一套成本判断。能完成当前请求只是起点，还要检查整条Trace是否更便宜、最差输入是否回退，以及决策本身是否满足资源限制。</w:t>
-      </w:r>
-    </w:p>
-    <w:p>
-      <w:r>
-        <w:t>相比官方baseline逐iov选路、第二次未命中后尝试一次HBM提升，我们把相邻请求一起规划，比较多条路径的整体代价，再按复用收益决定缓存投入。关键认识是：少搬字节、少一次复制、命中更多，都不一定让总成本更低；必须连同调用费和资源等待一起计算。依据、对照和证据集中在设计依据与优化评述（../02_算法方案/设计依据与优化评述.md）。</w:t>
-      </w:r>
-    </w:p>
-    <w:p>
-      <w:r>
-        <w:t>当前源码的公开自动分为89.9792/90；438条输入各三次运行及官方回放通过。较差输入也完整保留，公开成绩不代表隐藏集排名或真实硬件加速。详细结果见验证报告（../05_验证结果/验证报告.md）。</w:t>
-      </w:r>
-    </w:p>
-    <w:p>
-      <w:r>
-        <w:t>理解本文后，继续阅读算法设计（../02_算法方案/算法设计.md）：它按前台五步、完成后的缓存流程、贯穿例子和设计取舍展开，末尾再给出实现参数、复杂度与代码位置。程序目录（../03_程序/）和测试操作手册（../04_测试复现/测试操作手册.md）用于实际运行。</w:t>
-      </w:r>
-    </w:p>
-    <w:p>
-      <w:r>
-        <w:t>在Linux或Windows WSL中进入材料根目录，可以执行：</w:t>
+        <w:t>在Linux或Windows WSL中进入材料根目录：</w:t>
       </w:r>
     </w:p>
     <w:p>
@@ -1370,7 +2198,7 @@
           <w:rFonts w:ascii="Courier New" w:hAnsi="Courier New"/>
           <w:sz w:val="16"/>
         </w:rPr>
-        <w:t>python3 run.py solve --prebuilt --input 03_程序/data/small_mixed.json --result result.json</w:t>
+        <w:t>python3 run.py solve --prebuilt --input 02_算法方案/示例/相邻对齐小读输入.json --result result.json</w:t>
       </w:r>
     </w:p>
     <w:p>
@@ -1402,7 +2230,7 @@
     </w:p>
     <w:p>
       <w:r>
-        <w:t>第一条使用Linux x86_64静态程序并自动校验；后面三条需要C++17编译器、make及Python 3.10或更高版本。图文和Word可直接阅读，不必先理解C++实现。</w:t>
+        <w:t>第一条使用Linux x86_64静态程序并自动校验；后面三条需要C++17编译器、make及Python 3.10或更高版本。完整命令见测试操作手册（../04_测试复现/测试操作手册.md），图文与Word可直接阅读。</w:t>
       </w:r>
     </w:p>
     <w:sectPr>

</xml_diff>